<commit_message>
revert: restore docs to original version before edits
</commit_message>
<xml_diff>
--- a/docs/BACKEND_REPORT.docx
+++ b/docs/BACKEND_REPORT.docx
@@ -33,63 +33,14 @@
         <w:t>1. ภาพรวมสถาปัตยกรรมระบบ (System Architecture Overview)</w:t>
       </w:r>
     </w:p>
-    <w:tbl>
-      <w:tblPr>
-        <w:tblW w:type="auto" w:w="0"/>
-        <w:jc w:val="center"/>
-        <w:tblLayout w:type="fixed"/>
-        <w:tblLook w:firstColumn="1" w:firstRow="1" w:lastColumn="0" w:lastRow="0" w:noHBand="0" w:noVBand="1" w:val="04A0"/>
-      </w:tblPr>
-      <w:tblGrid>
-        <w:gridCol w:w="9360"/>
-      </w:tblGrid>
-      <w:tr>
-        <w:tc>
-          <w:tcPr>
-            <w:tcW w:type="dxa" w:w="9360"/>
-            <w:shd w:fill="EBF3FB"/>
-            <w:tcMar>
-              <w:top w:w="100" w:type="dxa"/>
-              <w:bottom w:w="100" w:type="dxa"/>
-              <w:left w:w="150" w:type="dxa"/>
-              <w:right w:w="150" w:type="dxa"/>
-            </w:tcMar>
-          </w:tcPr>
-          <w:p>
-            <w:pPr>
-              <w:spacing w:line="276" w:lineRule="auto"/>
-            </w:pPr>
-            <w:r>
-              <w:rPr>
-                <w:rFonts w:ascii="Cordia New" w:hAnsi="Cordia New"/>
-                <w:b/>
-                <w:color w:val="1F4E79"/>
-                <w:sz w:val="28"/>
-              </w:rPr>
-              <w:t>💡 เข้าใจง่ายแบบภาษาคน: เปรียบเสมือน 'ร้านอาหารอัจฉริยะ'</w:t>
-              <w:br/>
-            </w:r>
-            <w:r>
-              <w:rPr>
-                <w:rFonts w:ascii="Cordia New" w:hAnsi="Cordia New"/>
-                <w:color w:val="333333"/>
-                <w:sz w:val="26"/>
-              </w:rPr>
-              <w:t>1. Nginx Reverse Proxy (พนักงานต้อนรับหน้าร้าน): รับคำขอจากลูกค้าหน้าเว็บ แล้วส่งต่อเข้าครัว</w:t>
-              <w:br/>
-              <w:t>2. Flask Backend (หัวหน้าเชฟ): รับออร์เดอร์ ตรวจสอบบัตรสมาชิก (JWT) แล้วกระจายงานให้แผนกต่าง ๆ</w:t>
-              <w:br/>
-              <w:t>3. AI GPU Server (เตาอบพลังสูง): สร้างภาพ AI Stable Diffusion ซึ่งกินพลังงานการ์ดจอสูงมาก</w:t>
-              <w:br/>
-              <w:t>4. Image Processing Services (แผนกตกแต่งจานด่วน): ใช้ OpenCV/MediaPipe ตัดพื้นหลัง จับท่ามือ ทำงานเสร็จไวบนตัว Backend เอง</w:t>
-              <w:br/>
-              <w:t>5. SQLite Database (ห้องคลังเสบียง): จัดเก็บข้อมูลผู้ใช้และไฟล์ภาพ BLOB ทั้งหมดอย่างปลอดภัย</w:t>
-            </w:r>
-          </w:p>
-        </w:tc>
-      </w:tr>
-    </w:tbl>
-    <w:p/>
+    <w:p>
+      <w:pPr>
+        <w:spacing w:line="276" w:lineRule="auto"/>
+      </w:pPr>
+      <w:r>
+        <w:t>ระบบ Backend ของโครงการ LUMA พัฒนาขึ้นด้วยภาษา Python โดยใช้ Flask Framework ซึ่งได้รับการออกแบบตามหลักสถาปัตยกรรม Application Factory Pattern และแยกกลุ่มเส้นทางการทำงานออกเป็น Flask Blueprints เพื่อให้ง่ายต่อการดูแลรักษาและขยายระบบในอนาคต</w:t>
+      </w:r>
+    </w:p>
     <w:p>
       <w:pPr>
         <w:pStyle w:val="ListBullet"/>
@@ -101,7 +52,7 @@
         <w:t xml:space="preserve">Framework: </w:t>
       </w:r>
       <w:r>
-        <w:t>Python 3.11 + Flask 3.0.3 ทำงานบนพอร์ต 5000 (0.0.0.0) หลัง Nginx Reverse Proxy</w:t>
+        <w:t>Python 3.11 + Flask 3.0.3 (เชื่อมต่อผ่าน WSGI และ Nginx Reverse Proxy)</w:t>
       </w:r>
     </w:p>
     <w:p>
@@ -115,7 +66,7 @@
         <w:t xml:space="preserve">Database Layer: </w:t>
       </w:r>
       <w:r>
-        <w:t>SQLite (database/database.db) จัดการผ่าน Flask-SQLAlchemy พร้อมระบบ Auto-Migration</w:t>
+        <w:t>SQLite (database/database.db) เชื่อมต่อและบริหารจัดการผ่าน Flask-SQLAlchemy (ORM)</w:t>
       </w:r>
     </w:p>
     <w:p>
@@ -126,10 +77,10 @@
         <w:rPr>
           <w:b/>
         </w:rPr>
-        <w:t xml:space="preserve">Security &amp; Auth: </w:t>
+        <w:t xml:space="preserve">Authentication &amp; Security: </w:t>
       </w:r>
       <w:r>
-        <w:t>JSON Web Token (JWT HS256, อายุ 24 ชม.), Password Hashing (PBKDF2/SHA256) และระบบ Anti-Hopping / IDOR</w:t>
+        <w:t>JSON Web Token (JWT HS256, อายุ 24 ชม.), Password Hashing (PBKDF2/SHA256), และระบบ Anti-Hopping / IDOR Protection ป้องกันการสวมรอยข้ามบัญชี</w:t>
       </w:r>
     </w:p>
     <w:p>
@@ -140,24 +91,10 @@
         <w:rPr>
           <w:b/>
         </w:rPr>
-        <w:t xml:space="preserve">AI Generation: </w:t>
+        <w:t xml:space="preserve">AI Integration: </w:t>
       </w:r>
       <w:r>
-        <w:t>เชื่อมต่อไปยัง Stable Diffusion WebUI / Forge ผ่าน REST API พร้อมระบบ Concurrency GPU Mutex Lock</w:t>
-      </w:r>
-    </w:p>
-    <w:p>
-      <w:pPr>
-        <w:pStyle w:val="ListBullet"/>
-      </w:pPr>
-      <w:r>
-        <w:rPr>
-          <w:b/>
-        </w:rPr>
-        <w:t xml:space="preserve">Edge Image Processing: </w:t>
-      </w:r>
-      <w:r>
-        <w:t>ประมวลผลภาพและตรวจจับท่าทางด้วย OpenCV และ Google MediaPipe ทำงานบน Backend โดยตรง (process_bp)</w:t>
+        <w:t>เชื่อมต่อไปยัง Stable Diffusion AI Server ผ่าน REST API พร้อมระบบ Concurrency Lock (Mutex Queue) ป้องกันงานชนกันบน GPU</w:t>
       </w:r>
     </w:p>
     <w:p/>
@@ -172,21 +109,7 @@
           <w:color w:val="1F4E79"/>
           <w:sz w:val="36"/>
         </w:rPr>
-        <w:t>2. เจาะลึกโค้ดและกลไกสำคัญของ Backend (พร้อมอธิบายภาษาคน)</w:t>
-      </w:r>
-    </w:p>
-    <w:p>
-      <w:pPr>
-        <w:pStyle w:val="Heading2"/>
-      </w:pPr>
-      <w:r>
-        <w:rPr>
-          <w:rFonts w:ascii="Cordia New" w:hAnsi="Cordia New"/>
-          <w:b/>
-          <w:color w:val="2F5597"/>
-          <w:sz w:val="32"/>
-        </w:rPr>
-        <w:t>2.1 โรงงานประกอบแอปและระบบซ่อมฐานข้อมูลอัตโนมัติ (app/__init__.py)</w:t>
+        <w:t>2. หน้าที่และความรับผิดชอบของแต่ละไฟล์ใน Backend</w:t>
       </w:r>
     </w:p>
     <w:tbl>
@@ -197,18 +120,97 @@
         <w:tblLook w:firstColumn="1" w:firstRow="1" w:lastColumn="0" w:lastRow="0" w:noHBand="0" w:noVBand="1" w:val="04A0"/>
       </w:tblPr>
       <w:tblGrid>
-        <w:gridCol w:w="9360"/>
+        <w:gridCol w:w="4680"/>
+        <w:gridCol w:w="4680"/>
       </w:tblGrid>
       <w:tr>
         <w:tc>
           <w:tcPr>
-            <w:tcW w:type="dxa" w:w="9360"/>
-            <w:shd w:fill="EBF3FB"/>
+            <w:tcW w:type="dxa" w:w="3168"/>
             <w:tcMar>
-              <w:top w:w="100" w:type="dxa"/>
-              <w:bottom w:w="100" w:type="dxa"/>
-              <w:left w:w="150" w:type="dxa"/>
-              <w:right w:w="150" w:type="dxa"/>
+              <w:top w:w="80" w:type="dxa"/>
+              <w:bottom w:w="80" w:type="dxa"/>
+              <w:left w:w="120" w:type="dxa"/>
+              <w:right w:w="120" w:type="dxa"/>
+            </w:tcMar>
+            <w:shd w:fill="1F4E79"/>
+          </w:tcPr>
+          <w:p>
+            <w:pPr>
+              <w:spacing w:line="276" w:lineRule="auto"/>
+            </w:pPr>
+            <w:r>
+              <w:rPr>
+                <w:rFonts w:ascii="Cordia New" w:hAnsi="Cordia New"/>
+                <w:b/>
+                <w:color w:val="FFFFFF"/>
+                <w:sz w:val="28"/>
+              </w:rPr>
+              <w:t>โฟลเดอร์ / ชื่อไฟล์</w:t>
+            </w:r>
+          </w:p>
+        </w:tc>
+        <w:tc>
+          <w:tcPr>
+            <w:tcW w:type="dxa" w:w="6192"/>
+            <w:tcMar>
+              <w:top w:w="80" w:type="dxa"/>
+              <w:bottom w:w="80" w:type="dxa"/>
+              <w:left w:w="120" w:type="dxa"/>
+              <w:right w:w="120" w:type="dxa"/>
+            </w:tcMar>
+            <w:shd w:fill="1F4E79"/>
+          </w:tcPr>
+          <w:p>
+            <w:pPr>
+              <w:spacing w:line="276" w:lineRule="auto"/>
+            </w:pPr>
+            <w:r>
+              <w:rPr>
+                <w:rFonts w:ascii="Cordia New" w:hAnsi="Cordia New"/>
+                <w:b/>
+                <w:color w:val="FFFFFF"/>
+                <w:sz w:val="28"/>
+              </w:rPr>
+              <w:t>หน้าที่และความรับผิดชอบหลัก</w:t>
+            </w:r>
+          </w:p>
+        </w:tc>
+      </w:tr>
+      <w:tr>
+        <w:tc>
+          <w:tcPr>
+            <w:tcW w:type="dxa" w:w="3168"/>
+            <w:tcMar>
+              <w:top w:w="80" w:type="dxa"/>
+              <w:bottom w:w="80" w:type="dxa"/>
+              <w:left w:w="120" w:type="dxa"/>
+              <w:right w:w="120" w:type="dxa"/>
+            </w:tcMar>
+            <w:shd w:fill="F2F2F2"/>
+          </w:tcPr>
+          <w:p>
+            <w:pPr>
+              <w:spacing w:line="276" w:lineRule="auto"/>
+            </w:pPr>
+            <w:r>
+              <w:rPr>
+                <w:rFonts w:ascii="Cordia New" w:hAnsi="Cordia New"/>
+                <w:b/>
+                <w:sz w:val="26"/>
+              </w:rPr>
+              <w:t>backend/run.py</w:t>
+            </w:r>
+          </w:p>
+        </w:tc>
+        <w:tc>
+          <w:tcPr>
+            <w:tcW w:type="dxa" w:w="6192"/>
+            <w:tcMar>
+              <w:top w:w="80" w:type="dxa"/>
+              <w:bottom w:w="80" w:type="dxa"/>
+              <w:left w:w="120" w:type="dxa"/>
+              <w:right w:w="120" w:type="dxa"/>
             </w:tcMar>
           </w:tcPr>
           <w:p>
@@ -218,448 +220,98 @@
             <w:r>
               <w:rPr>
                 <w:rFonts w:ascii="Cordia New" w:hAnsi="Cordia New"/>
-                <w:b/>
-                <w:color w:val="1F4E79"/>
-                <w:sz w:val="28"/>
-              </w:rPr>
-              <w:t>💡 ภาษาคน: ระบบตรวจและซ่อมบ้านอัตโนมัติ</w:t>
-              <w:br/>
-            </w:r>
-            <w:r>
-              <w:rPr>
-                <w:rFonts w:ascii="Cordia New" w:hAnsi="Cordia New"/>
-                <w:color w:val="333333"/>
                 <w:sz w:val="26"/>
               </w:rPr>
-              <w:t>เวลาทีมงานเพิ่มคอลัมน์ใหม่ในตารางฐานข้อมูล SQLite หากรันโค้ดบนเครื่องเพื่อนปกติจะ Error ทันทีว่าหาคอลัมน์ไม่เจอ แต่โค้ดตรงนี้มีระบบ Auto-Migration ตรวจสอบโครงสร้างตารางทุกครั้งตอนเริ่มแอป หากพบคอลัมน์ใดยังไม่มี (เช่น image_data, params) ระบบจะรัน ALTER TABLE เพิ่มให้อัตโนมัติทันที ไม่ต้องเปิดโปรแกรมฐานข้อมูลไปแก้เองให้ปวดหัว!</w:t>
+              <w:t>จุดเริ่มต้นรันเซิร์ฟเวอร์ (Entry Point) ดึงค่าพอร์ต (PORT=5000) และเปิดบริการบน host 0.0.0.0</w:t>
             </w:r>
           </w:p>
         </w:tc>
       </w:tr>
-    </w:tbl>
-    <w:p/>
-    <w:tbl>
-      <w:tblPr>
-        <w:tblW w:type="auto" w:w="0"/>
-        <w:jc w:val="center"/>
-        <w:tblLayout w:type="fixed"/>
-        <w:tblLook w:firstColumn="1" w:firstRow="1" w:lastColumn="0" w:lastRow="0" w:noHBand="0" w:noVBand="1" w:val="04A0"/>
-      </w:tblPr>
-      <w:tblGrid>
-        <w:gridCol w:w="9360"/>
-      </w:tblGrid>
       <w:tr>
         <w:tc>
           <w:tcPr>
-            <w:tcW w:type="dxa" w:w="9360"/>
-            <w:shd w:fill="F4F5F7"/>
+            <w:tcW w:type="dxa" w:w="3168"/>
             <w:tcMar>
-              <w:top w:w="100" w:type="dxa"/>
-              <w:bottom w:w="100" w:type="dxa"/>
-              <w:left w:w="150" w:type="dxa"/>
-              <w:right w:w="150" w:type="dxa"/>
+              <w:top w:w="80" w:type="dxa"/>
+              <w:bottom w:w="80" w:type="dxa"/>
+              <w:left w:w="120" w:type="dxa"/>
+              <w:right w:w="120" w:type="dxa"/>
             </w:tcMar>
+            <w:shd w:fill="F2F2F2"/>
           </w:tcPr>
           <w:p>
             <w:pPr>
-              <w:spacing w:line="252" w:lineRule="auto" w:after="40"/>
+              <w:spacing w:line="276" w:lineRule="auto"/>
             </w:pPr>
             <w:r>
               <w:rPr>
-                <w:rFonts w:ascii="Consolas" w:hAnsi="Consolas"/>
-                <w:color w:val="24292E"/>
-                <w:sz w:val="19"/>
+                <w:rFonts w:ascii="Cordia New" w:hAnsi="Cordia New"/>
+                <w:b/>
+                <w:sz w:val="26"/>
               </w:rPr>
-              <w:t>def create_app(test_config=None) -&gt; Flask:</w:t>
+              <w:t>backend/config.py</w:t>
             </w:r>
           </w:p>
+        </w:tc>
+        <w:tc>
+          <w:tcPr>
+            <w:tcW w:type="dxa" w:w="6192"/>
+            <w:tcMar>
+              <w:top w:w="80" w:type="dxa"/>
+              <w:bottom w:w="80" w:type="dxa"/>
+              <w:left w:w="120" w:type="dxa"/>
+              <w:right w:w="120" w:type="dxa"/>
+            </w:tcMar>
+            <w:shd w:fill="FAFAFA"/>
+          </w:tcPr>
           <w:p>
             <w:pPr>
-              <w:spacing w:line="252" w:lineRule="auto" w:after="40"/>
+              <w:spacing w:line="276" w:lineRule="auto"/>
             </w:pPr>
             <w:r>
               <w:rPr>
-                <w:rFonts w:ascii="Consolas" w:hAnsi="Consolas"/>
-                <w:color w:val="24292E"/>
-                <w:sz w:val="19"/>
+                <w:rFonts w:ascii="Cordia New" w:hAnsi="Cordia New"/>
+                <w:sz w:val="26"/>
               </w:rPr>
-              <w:t xml:space="preserve">    app = Flask(__name__)</w:t>
-            </w:r>
-          </w:p>
-          <w:p>
-            <w:pPr>
-              <w:spacing w:line="252" w:lineRule="auto" w:after="40"/>
-            </w:pPr>
-            <w:r>
-              <w:rPr>
-                <w:rFonts w:ascii="Consolas" w:hAnsi="Consolas"/>
-                <w:color w:val="24292E"/>
-                <w:sz w:val="19"/>
-              </w:rPr>
-              <w:t xml:space="preserve">    app.config.from_object(Config)</w:t>
-            </w:r>
-          </w:p>
-          <w:p>
-            <w:pPr>
-              <w:spacing w:line="252" w:lineRule="auto" w:after="40"/>
-            </w:pPr>
-            <w:r>
-              <w:rPr>
-                <w:rFonts w:ascii="Consolas" w:hAnsi="Consolas"/>
-                <w:color w:val="24292E"/>
-                <w:sz w:val="19"/>
-              </w:rPr>
-              <w:t xml:space="preserve">    CORS(app, origins=Config.CORS_ORIGINS)</w:t>
-            </w:r>
-          </w:p>
-          <w:p>
-            <w:pPr>
-              <w:spacing w:line="252" w:lineRule="auto" w:after="40"/>
-            </w:pPr>
-            <w:r>
-              <w:rPr>
-                <w:rFonts w:ascii="Consolas" w:hAnsi="Consolas"/>
-                <w:color w:val="24292E"/>
-                <w:sz w:val="19"/>
-              </w:rPr>
-              <w:t xml:space="preserve">    db.init_app(app)</w:t>
-            </w:r>
-          </w:p>
-          <w:p>
-            <w:pPr>
-              <w:spacing w:line="252" w:lineRule="auto" w:after="40"/>
-            </w:pPr>
-            <w:r>
-              <w:rPr>
-                <w:rFonts w:ascii="Consolas" w:hAnsi="Consolas"/>
-                <w:color w:val="24292E"/>
-                <w:sz w:val="19"/>
-              </w:rPr>
-            </w:r>
-          </w:p>
-          <w:p>
-            <w:pPr>
-              <w:spacing w:line="252" w:lineRule="auto" w:after="40"/>
-            </w:pPr>
-            <w:r>
-              <w:rPr>
-                <w:rFonts w:ascii="Consolas" w:hAnsi="Consolas"/>
-                <w:color w:val="24292E"/>
-                <w:sz w:val="19"/>
-              </w:rPr>
-              <w:t xml:space="preserve">    # ลงทะเบียน Blueprints 5 แผนกหลัก</w:t>
-            </w:r>
-          </w:p>
-          <w:p>
-            <w:pPr>
-              <w:spacing w:line="252" w:lineRule="auto" w:after="40"/>
-            </w:pPr>
-            <w:r>
-              <w:rPr>
-                <w:rFonts w:ascii="Consolas" w:hAnsi="Consolas"/>
-                <w:color w:val="24292E"/>
-                <w:sz w:val="19"/>
-              </w:rPr>
-              <w:t xml:space="preserve">    app.register_blueprint(auth_bp, url_prefix="/api/v1")</w:t>
-            </w:r>
-          </w:p>
-          <w:p>
-            <w:pPr>
-              <w:spacing w:line="252" w:lineRule="auto" w:after="40"/>
-            </w:pPr>
-            <w:r>
-              <w:rPr>
-                <w:rFonts w:ascii="Consolas" w:hAnsi="Consolas"/>
-                <w:color w:val="24292E"/>
-                <w:sz w:val="19"/>
-              </w:rPr>
-              <w:t xml:space="preserve">    app.register_blueprint(profile_bp, url_prefix="/api/v1")</w:t>
-            </w:r>
-          </w:p>
-          <w:p>
-            <w:pPr>
-              <w:spacing w:line="252" w:lineRule="auto" w:after="40"/>
-            </w:pPr>
-            <w:r>
-              <w:rPr>
-                <w:rFonts w:ascii="Consolas" w:hAnsi="Consolas"/>
-                <w:color w:val="24292E"/>
-                <w:sz w:val="19"/>
-              </w:rPr>
-              <w:t xml:space="preserve">    app.register_blueprint(sd_bp, url_prefix="/api/v1")</w:t>
-            </w:r>
-          </w:p>
-          <w:p>
-            <w:pPr>
-              <w:spacing w:line="252" w:lineRule="auto" w:after="40"/>
-            </w:pPr>
-            <w:r>
-              <w:rPr>
-                <w:rFonts w:ascii="Consolas" w:hAnsi="Consolas"/>
-                <w:color w:val="24292E"/>
-                <w:sz w:val="19"/>
-              </w:rPr>
-              <w:t xml:space="preserve">    app.register_blueprint(history_bp, url_prefix="/api/v1")</w:t>
-            </w:r>
-          </w:p>
-          <w:p>
-            <w:pPr>
-              <w:spacing w:line="252" w:lineRule="auto" w:after="40"/>
-            </w:pPr>
-            <w:r>
-              <w:rPr>
-                <w:rFonts w:ascii="Consolas" w:hAnsi="Consolas"/>
-                <w:color w:val="24292E"/>
-                <w:sz w:val="19"/>
-              </w:rPr>
-              <w:t xml:space="preserve">    app.register_blueprint(process_bp, url_prefix="/api/v1")</w:t>
-            </w:r>
-          </w:p>
-          <w:p>
-            <w:pPr>
-              <w:spacing w:line="252" w:lineRule="auto" w:after="40"/>
-            </w:pPr>
-            <w:r>
-              <w:rPr>
-                <w:rFonts w:ascii="Consolas" w:hAnsi="Consolas"/>
-                <w:color w:val="24292E"/>
-                <w:sz w:val="19"/>
-              </w:rPr>
-            </w:r>
-          </w:p>
-          <w:p>
-            <w:pPr>
-              <w:spacing w:line="252" w:lineRule="auto" w:after="40"/>
-            </w:pPr>
-            <w:r>
-              <w:rPr>
-                <w:rFonts w:ascii="Consolas" w:hAnsi="Consolas"/>
-                <w:color w:val="24292E"/>
-                <w:sz w:val="19"/>
-              </w:rPr>
-              <w:t xml:space="preserve">    # ตรวจสอบและเพิ่มคอลัมน์ให้อัตโนมัติ (Auto Schema Migration)</w:t>
-            </w:r>
-          </w:p>
-          <w:p>
-            <w:pPr>
-              <w:spacing w:line="252" w:lineRule="auto" w:after="40"/>
-            </w:pPr>
-            <w:r>
-              <w:rPr>
-                <w:rFonts w:ascii="Consolas" w:hAnsi="Consolas"/>
-                <w:color w:val="24292E"/>
-                <w:sz w:val="19"/>
-              </w:rPr>
-              <w:t xml:space="preserve">    with app.app_context():</w:t>
-            </w:r>
-          </w:p>
-          <w:p>
-            <w:pPr>
-              <w:spacing w:line="252" w:lineRule="auto" w:after="40"/>
-            </w:pPr>
-            <w:r>
-              <w:rPr>
-                <w:rFonts w:ascii="Consolas" w:hAnsi="Consolas"/>
-                <w:color w:val="24292E"/>
-                <w:sz w:val="19"/>
-              </w:rPr>
-              <w:t xml:space="preserve">        db.create_all()</w:t>
-            </w:r>
-          </w:p>
-          <w:p>
-            <w:pPr>
-              <w:spacing w:line="252" w:lineRule="auto" w:after="40"/>
-            </w:pPr>
-            <w:r>
-              <w:rPr>
-                <w:rFonts w:ascii="Consolas" w:hAnsi="Consolas"/>
-                <w:color w:val="24292E"/>
-                <w:sz w:val="19"/>
-              </w:rPr>
-              <w:t xml:space="preserve">        inspector = db.inspect(db.engine)</w:t>
-            </w:r>
-          </w:p>
-          <w:p>
-            <w:pPr>
-              <w:spacing w:line="252" w:lineRule="auto" w:after="40"/>
-            </w:pPr>
-            <w:r>
-              <w:rPr>
-                <w:rFonts w:ascii="Consolas" w:hAnsi="Consolas"/>
-                <w:color w:val="24292E"/>
-                <w:sz w:val="19"/>
-              </w:rPr>
-              <w:t xml:space="preserve">        existing = {c["name"] for c in inspector.get_columns("generations")}</w:t>
-            </w:r>
-          </w:p>
-          <w:p>
-            <w:pPr>
-              <w:spacing w:line="252" w:lineRule="auto" w:after="40"/>
-            </w:pPr>
-            <w:r>
-              <w:rPr>
-                <w:rFonts w:ascii="Consolas" w:hAnsi="Consolas"/>
-                <w:color w:val="24292E"/>
-                <w:sz w:val="19"/>
-              </w:rPr>
-              <w:t xml:space="preserve">        migrations = [</w:t>
-            </w:r>
-          </w:p>
-          <w:p>
-            <w:pPr>
-              <w:spacing w:line="252" w:lineRule="auto" w:after="40"/>
-            </w:pPr>
-            <w:r>
-              <w:rPr>
-                <w:rFonts w:ascii="Consolas" w:hAnsi="Consolas"/>
-                <w:color w:val="24292E"/>
-                <w:sz w:val="19"/>
-              </w:rPr>
-              <w:t xml:space="preserve">            ("image_data", "ALTER TABLE generations ADD COLUMN image_data BLOB"),</w:t>
-            </w:r>
-          </w:p>
-          <w:p>
-            <w:pPr>
-              <w:spacing w:line="252" w:lineRule="auto" w:after="40"/>
-            </w:pPr>
-            <w:r>
-              <w:rPr>
-                <w:rFonts w:ascii="Consolas" w:hAnsi="Consolas"/>
-                <w:color w:val="24292E"/>
-                <w:sz w:val="19"/>
-              </w:rPr>
-              <w:t xml:space="preserve">            ("category", "ALTER TABLE generations ADD COLUMN category VARCHAR(50) DEFAULT 'sd_generate'"),</w:t>
-            </w:r>
-          </w:p>
-          <w:p>
-            <w:pPr>
-              <w:spacing w:line="252" w:lineRule="auto" w:after="40"/>
-            </w:pPr>
-            <w:r>
-              <w:rPr>
-                <w:rFonts w:ascii="Consolas" w:hAnsi="Consolas"/>
-                <w:color w:val="24292E"/>
-                <w:sz w:val="19"/>
-              </w:rPr>
-              <w:t xml:space="preserve">            ("params", "ALTER TABLE generations ADD COLUMN params TEXT DEFAULT '{}'"),</w:t>
-            </w:r>
-          </w:p>
-          <w:p>
-            <w:pPr>
-              <w:spacing w:line="252" w:lineRule="auto" w:after="40"/>
-            </w:pPr>
-            <w:r>
-              <w:rPr>
-                <w:rFonts w:ascii="Consolas" w:hAnsi="Consolas"/>
-                <w:color w:val="24292E"/>
-                <w:sz w:val="19"/>
-              </w:rPr>
-              <w:t xml:space="preserve">        ]</w:t>
-            </w:r>
-          </w:p>
-          <w:p>
-            <w:pPr>
-              <w:spacing w:line="252" w:lineRule="auto" w:after="40"/>
-            </w:pPr>
-            <w:r>
-              <w:rPr>
-                <w:rFonts w:ascii="Consolas" w:hAnsi="Consolas"/>
-                <w:color w:val="24292E"/>
-                <w:sz w:val="19"/>
-              </w:rPr>
-              <w:t xml:space="preserve">        for col, stmt in migrations:</w:t>
-            </w:r>
-          </w:p>
-          <w:p>
-            <w:pPr>
-              <w:spacing w:line="252" w:lineRule="auto" w:after="40"/>
-            </w:pPr>
-            <w:r>
-              <w:rPr>
-                <w:rFonts w:ascii="Consolas" w:hAnsi="Consolas"/>
-                <w:color w:val="24292E"/>
-                <w:sz w:val="19"/>
-              </w:rPr>
-              <w:t xml:space="preserve">            if col not in existing:</w:t>
-            </w:r>
-          </w:p>
-          <w:p>
-            <w:pPr>
-              <w:spacing w:line="252" w:lineRule="auto" w:after="40"/>
-            </w:pPr>
-            <w:r>
-              <w:rPr>
-                <w:rFonts w:ascii="Consolas" w:hAnsi="Consolas"/>
-                <w:color w:val="24292E"/>
-                <w:sz w:val="19"/>
-              </w:rPr>
-              <w:t xml:space="preserve">                db.session.execute(db.text(stmt))</w:t>
-            </w:r>
-          </w:p>
-          <w:p>
-            <w:pPr>
-              <w:spacing w:line="252" w:lineRule="auto" w:after="40"/>
-            </w:pPr>
-            <w:r>
-              <w:rPr>
-                <w:rFonts w:ascii="Consolas" w:hAnsi="Consolas"/>
-                <w:color w:val="24292E"/>
-                <w:sz w:val="19"/>
-              </w:rPr>
-              <w:t xml:space="preserve">        db.session.commit()</w:t>
-            </w:r>
-          </w:p>
-          <w:p>
-            <w:pPr>
-              <w:spacing w:line="252" w:lineRule="auto" w:after="40"/>
-            </w:pPr>
-            <w:r>
-              <w:rPr>
-                <w:rFonts w:ascii="Consolas" w:hAnsi="Consolas"/>
-                <w:color w:val="24292E"/>
-                <w:sz w:val="19"/>
-              </w:rPr>
-              <w:t xml:space="preserve">    return app</w:t>
+              <w:t>ศูนย์กลางคอนฟิกูเรชัน (Central Config) เช่น Secret Key, CORS Origins, URL ของ AI Server</w:t>
             </w:r>
           </w:p>
         </w:tc>
       </w:tr>
-    </w:tbl>
-    <w:p/>
-    <w:p>
-      <w:pPr>
-        <w:pStyle w:val="Heading2"/>
-      </w:pPr>
-      <w:r>
-        <w:rPr>
-          <w:rFonts w:ascii="Cordia New" w:hAnsi="Cordia New"/>
-          <w:b/>
-          <w:color w:val="2F5597"/>
-          <w:sz w:val="32"/>
-        </w:rPr>
-        <w:t>2.2 ยามตรวจบัตรและป้องกันการแอบดูรูปคนอื่น (jwt_auth.py &amp; sd.py)</w:t>
-      </w:r>
-    </w:p>
-    <w:tbl>
-      <w:tblPr>
-        <w:tblW w:type="auto" w:w="0"/>
-        <w:jc w:val="center"/>
-        <w:tblLayout w:type="fixed"/>
-        <w:tblLook w:firstColumn="1" w:firstRow="1" w:lastColumn="0" w:lastRow="0" w:noHBand="0" w:noVBand="1" w:val="04A0"/>
-      </w:tblPr>
-      <w:tblGrid>
-        <w:gridCol w:w="9360"/>
-      </w:tblGrid>
       <w:tr>
         <w:tc>
           <w:tcPr>
-            <w:tcW w:type="dxa" w:w="9360"/>
-            <w:shd w:fill="EBF3FB"/>
+            <w:tcW w:type="dxa" w:w="3168"/>
             <w:tcMar>
-              <w:top w:w="100" w:type="dxa"/>
-              <w:bottom w:w="100" w:type="dxa"/>
-              <w:left w:w="150" w:type="dxa"/>
-              <w:right w:w="150" w:type="dxa"/>
+              <w:top w:w="80" w:type="dxa"/>
+              <w:bottom w:w="80" w:type="dxa"/>
+              <w:left w:w="120" w:type="dxa"/>
+              <w:right w:w="120" w:type="dxa"/>
+            </w:tcMar>
+            <w:shd w:fill="F2F2F2"/>
+          </w:tcPr>
+          <w:p>
+            <w:pPr>
+              <w:spacing w:line="276" w:lineRule="auto"/>
+            </w:pPr>
+            <w:r>
+              <w:rPr>
+                <w:rFonts w:ascii="Cordia New" w:hAnsi="Cordia New"/>
+                <w:b/>
+                <w:sz w:val="26"/>
+              </w:rPr>
+              <w:t>backend/app/__init__.py</w:t>
+            </w:r>
+          </w:p>
+        </w:tc>
+        <w:tc>
+          <w:tcPr>
+            <w:tcW w:type="dxa" w:w="6192"/>
+            <w:tcMar>
+              <w:top w:w="80" w:type="dxa"/>
+              <w:bottom w:w="80" w:type="dxa"/>
+              <w:left w:w="120" w:type="dxa"/>
+              <w:right w:w="120" w:type="dxa"/>
             </w:tcMar>
           </w:tcPr>
           <w:p>
@@ -669,412 +321,98 @@
             <w:r>
               <w:rPr>
                 <w:rFonts w:ascii="Cordia New" w:hAnsi="Cordia New"/>
-                <w:b/>
-                <w:color w:val="1F4E79"/>
-                <w:sz w:val="28"/>
-              </w:rPr>
-              <w:t>💡 ภาษาคน: ยามตรวจบัตร VIP และการกันขโมยดูรูป (Anti-Hopping / IDOR)</w:t>
-              <w:br/>
-            </w:r>
-            <w:r>
-              <w:rPr>
-                <w:rFonts w:ascii="Cordia New" w:hAnsi="Cordia New"/>
-                <w:color w:val="333333"/>
                 <w:sz w:val="26"/>
               </w:rPr>
-              <w:t>• @token_required: ยามตรวจบัตร VIP ถ้าไม่มีบัตรหรือบัตรหมดอายุ (เกิน 24 ชม.) จะไล่กลับทันที (401)</w:t>
-              <w:br/>
-              <w:t>• ป้องกันการแอบส่องรูปคนอื่น: ใครเดาสุ่มตัวเลขรูป /images/105 ระบบจะค้นหาเงื่อนไขคู่เสมอคือ id = 105 AND user_id = เจ้าของ ถ้าไม่ใช่เจ้าของ คำสั่งค้นหาจะหาไม่เจอ และตอบกลับว่า 404 ไม่พบรูปทันที!</w:t>
+              <w:t>Application Factory เริ่มต้น Flask, ผูก SQLAlchemy, ลงทะเบียน Blueprints ทั้งหมด และ Auto-Migration ตารางใน DB</w:t>
             </w:r>
           </w:p>
         </w:tc>
       </w:tr>
-    </w:tbl>
-    <w:p/>
-    <w:tbl>
-      <w:tblPr>
-        <w:tblW w:type="auto" w:w="0"/>
-        <w:jc w:val="center"/>
-        <w:tblLayout w:type="fixed"/>
-        <w:tblLook w:firstColumn="1" w:firstRow="1" w:lastColumn="0" w:lastRow="0" w:noHBand="0" w:noVBand="1" w:val="04A0"/>
-      </w:tblPr>
-      <w:tblGrid>
-        <w:gridCol w:w="9360"/>
-      </w:tblGrid>
       <w:tr>
         <w:tc>
           <w:tcPr>
-            <w:tcW w:type="dxa" w:w="9360"/>
-            <w:shd w:fill="F4F5F7"/>
+            <w:tcW w:type="dxa" w:w="3168"/>
             <w:tcMar>
-              <w:top w:w="100" w:type="dxa"/>
-              <w:bottom w:w="100" w:type="dxa"/>
-              <w:left w:w="150" w:type="dxa"/>
-              <w:right w:w="150" w:type="dxa"/>
+              <w:top w:w="80" w:type="dxa"/>
+              <w:bottom w:w="80" w:type="dxa"/>
+              <w:left w:w="120" w:type="dxa"/>
+              <w:right w:w="120" w:type="dxa"/>
             </w:tcMar>
+            <w:shd w:fill="F2F2F2"/>
           </w:tcPr>
           <w:p>
             <w:pPr>
-              <w:spacing w:line="252" w:lineRule="auto" w:after="40"/>
+              <w:spacing w:line="276" w:lineRule="auto"/>
             </w:pPr>
             <w:r>
               <w:rPr>
-                <w:rFonts w:ascii="Consolas" w:hAnsi="Consolas"/>
-                <w:color w:val="24292E"/>
-                <w:sz w:val="19"/>
+                <w:rFonts w:ascii="Cordia New" w:hAnsi="Cordia New"/>
+                <w:b/>
+                <w:sz w:val="26"/>
               </w:rPr>
-              <w:t># 1. ยามตรวจบัตร JWT Token (@token_required)</w:t>
+              <w:t>backend/app/extensions.py</w:t>
             </w:r>
           </w:p>
+        </w:tc>
+        <w:tc>
+          <w:tcPr>
+            <w:tcW w:type="dxa" w:w="6192"/>
+            <w:tcMar>
+              <w:top w:w="80" w:type="dxa"/>
+              <w:bottom w:w="80" w:type="dxa"/>
+              <w:left w:w="120" w:type="dxa"/>
+              <w:right w:w="120" w:type="dxa"/>
+            </w:tcMar>
+            <w:shd w:fill="FAFAFA"/>
+          </w:tcPr>
           <w:p>
             <w:pPr>
-              <w:spacing w:line="252" w:lineRule="auto" w:after="40"/>
+              <w:spacing w:line="276" w:lineRule="auto"/>
             </w:pPr>
             <w:r>
               <w:rPr>
-                <w:rFonts w:ascii="Consolas" w:hAnsi="Consolas"/>
-                <w:color w:val="24292E"/>
-                <w:sz w:val="19"/>
+                <w:rFonts w:ascii="Cordia New" w:hAnsi="Cordia New"/>
+                <w:sz w:val="26"/>
               </w:rPr>
-              <w:t>def token_required(f):</w:t>
-            </w:r>
-          </w:p>
-          <w:p>
-            <w:pPr>
-              <w:spacing w:line="252" w:lineRule="auto" w:after="40"/>
-            </w:pPr>
-            <w:r>
-              <w:rPr>
-                <w:rFonts w:ascii="Consolas" w:hAnsi="Consolas"/>
-                <w:color w:val="24292E"/>
-                <w:sz w:val="19"/>
-              </w:rPr>
-              <w:t xml:space="preserve">    @wraps(f)</w:t>
-            </w:r>
-          </w:p>
-          <w:p>
-            <w:pPr>
-              <w:spacing w:line="252" w:lineRule="auto" w:after="40"/>
-            </w:pPr>
-            <w:r>
-              <w:rPr>
-                <w:rFonts w:ascii="Consolas" w:hAnsi="Consolas"/>
-                <w:color w:val="24292E"/>
-                <w:sz w:val="19"/>
-              </w:rPr>
-              <w:t xml:space="preserve">    def decorated(*args, **kwargs):</w:t>
-            </w:r>
-          </w:p>
-          <w:p>
-            <w:pPr>
-              <w:spacing w:line="252" w:lineRule="auto" w:after="40"/>
-            </w:pPr>
-            <w:r>
-              <w:rPr>
-                <w:rFonts w:ascii="Consolas" w:hAnsi="Consolas"/>
-                <w:color w:val="24292E"/>
-                <w:sz w:val="19"/>
-              </w:rPr>
-              <w:t xml:space="preserve">        auth_header = request.headers.get("Authorization")</w:t>
-            </w:r>
-          </w:p>
-          <w:p>
-            <w:pPr>
-              <w:spacing w:line="252" w:lineRule="auto" w:after="40"/>
-            </w:pPr>
-            <w:r>
-              <w:rPr>
-                <w:rFonts w:ascii="Consolas" w:hAnsi="Consolas"/>
-                <w:color w:val="24292E"/>
-                <w:sz w:val="19"/>
-              </w:rPr>
-              <w:t xml:space="preserve">        if not auth_header or not auth_header.startswith("Bearer "):</w:t>
-            </w:r>
-          </w:p>
-          <w:p>
-            <w:pPr>
-              <w:spacing w:line="252" w:lineRule="auto" w:after="40"/>
-            </w:pPr>
-            <w:r>
-              <w:rPr>
-                <w:rFonts w:ascii="Consolas" w:hAnsi="Consolas"/>
-                <w:color w:val="24292E"/>
-                <w:sz w:val="19"/>
-              </w:rPr>
-              <w:t xml:space="preserve">            return error_response(UNAUTHORIZED, "Missing or invalid token", 401)</w:t>
-            </w:r>
-          </w:p>
-          <w:p>
-            <w:pPr>
-              <w:spacing w:line="252" w:lineRule="auto" w:after="40"/>
-            </w:pPr>
-            <w:r>
-              <w:rPr>
-                <w:rFonts w:ascii="Consolas" w:hAnsi="Consolas"/>
-                <w:color w:val="24292E"/>
-                <w:sz w:val="19"/>
-              </w:rPr>
-              <w:t xml:space="preserve">        token = auth_header.split()[1]</w:t>
-            </w:r>
-          </w:p>
-          <w:p>
-            <w:pPr>
-              <w:spacing w:line="252" w:lineRule="auto" w:after="40"/>
-            </w:pPr>
-            <w:r>
-              <w:rPr>
-                <w:rFonts w:ascii="Consolas" w:hAnsi="Consolas"/>
-                <w:color w:val="24292E"/>
-                <w:sz w:val="19"/>
-              </w:rPr>
-              <w:t xml:space="preserve">        try:</w:t>
-            </w:r>
-          </w:p>
-          <w:p>
-            <w:pPr>
-              <w:spacing w:line="252" w:lineRule="auto" w:after="40"/>
-            </w:pPr>
-            <w:r>
-              <w:rPr>
-                <w:rFonts w:ascii="Consolas" w:hAnsi="Consolas"/>
-                <w:color w:val="24292E"/>
-                <w:sz w:val="19"/>
-              </w:rPr>
-              <w:t xml:space="preserve">            payload = jwt.decode(token, get_jwt_secret(), algorithms=["HS256"])</w:t>
-            </w:r>
-          </w:p>
-          <w:p>
-            <w:pPr>
-              <w:spacing w:line="252" w:lineRule="auto" w:after="40"/>
-            </w:pPr>
-            <w:r>
-              <w:rPr>
-                <w:rFonts w:ascii="Consolas" w:hAnsi="Consolas"/>
-                <w:color w:val="24292E"/>
-                <w:sz w:val="19"/>
-              </w:rPr>
-              <w:t xml:space="preserve">            request.user_id = payload.get("user_id") # สกัด user_id แปะไว้ใน request</w:t>
-            </w:r>
-          </w:p>
-          <w:p>
-            <w:pPr>
-              <w:spacing w:line="252" w:lineRule="auto" w:after="40"/>
-            </w:pPr>
-            <w:r>
-              <w:rPr>
-                <w:rFonts w:ascii="Consolas" w:hAnsi="Consolas"/>
-                <w:color w:val="24292E"/>
-                <w:sz w:val="19"/>
-              </w:rPr>
-              <w:t xml:space="preserve">        except jwt.ExpiredSignatureError:</w:t>
-            </w:r>
-          </w:p>
-          <w:p>
-            <w:pPr>
-              <w:spacing w:line="252" w:lineRule="auto" w:after="40"/>
-            </w:pPr>
-            <w:r>
-              <w:rPr>
-                <w:rFonts w:ascii="Consolas" w:hAnsi="Consolas"/>
-                <w:color w:val="24292E"/>
-                <w:sz w:val="19"/>
-              </w:rPr>
-              <w:t xml:space="preserve">            return error_response(UNAUTHORIZED, "Token expired", 401)</w:t>
-            </w:r>
-          </w:p>
-          <w:p>
-            <w:pPr>
-              <w:spacing w:line="252" w:lineRule="auto" w:after="40"/>
-            </w:pPr>
-            <w:r>
-              <w:rPr>
-                <w:rFonts w:ascii="Consolas" w:hAnsi="Consolas"/>
-                <w:color w:val="24292E"/>
-                <w:sz w:val="19"/>
-              </w:rPr>
-              <w:t xml:space="preserve">        return f(*args, **kwargs)</w:t>
-            </w:r>
-          </w:p>
-          <w:p>
-            <w:pPr>
-              <w:spacing w:line="252" w:lineRule="auto" w:after="40"/>
-            </w:pPr>
-            <w:r>
-              <w:rPr>
-                <w:rFonts w:ascii="Consolas" w:hAnsi="Consolas"/>
-                <w:color w:val="24292E"/>
-                <w:sz w:val="19"/>
-              </w:rPr>
-              <w:t xml:space="preserve">    return decorated</w:t>
-            </w:r>
-          </w:p>
-          <w:p>
-            <w:pPr>
-              <w:spacing w:line="252" w:lineRule="auto" w:after="40"/>
-            </w:pPr>
-            <w:r>
-              <w:rPr>
-                <w:rFonts w:ascii="Consolas" w:hAnsi="Consolas"/>
-                <w:color w:val="24292E"/>
-                <w:sz w:val="19"/>
-              </w:rPr>
-            </w:r>
-          </w:p>
-          <w:p>
-            <w:pPr>
-              <w:spacing w:line="252" w:lineRule="auto" w:after="40"/>
-            </w:pPr>
-            <w:r>
-              <w:rPr>
-                <w:rFonts w:ascii="Consolas" w:hAnsi="Consolas"/>
-                <w:color w:val="24292E"/>
-                <w:sz w:val="19"/>
-              </w:rPr>
-              <w:t># 2. ป้องกันแอบดูรูปคนอื่น (Anti-Hopping) ใน sd.py</w:t>
-            </w:r>
-          </w:p>
-          <w:p>
-            <w:pPr>
-              <w:spacing w:line="252" w:lineRule="auto" w:after="40"/>
-            </w:pPr>
-            <w:r>
-              <w:rPr>
-                <w:rFonts w:ascii="Consolas" w:hAnsi="Consolas"/>
-                <w:color w:val="24292E"/>
-                <w:sz w:val="19"/>
-              </w:rPr>
-              <w:t>@sd_bp.route("/images/&lt;int:id&gt;", methods=["GET"])</w:t>
-            </w:r>
-          </w:p>
-          <w:p>
-            <w:pPr>
-              <w:spacing w:line="252" w:lineRule="auto" w:after="40"/>
-            </w:pPr>
-            <w:r>
-              <w:rPr>
-                <w:rFonts w:ascii="Consolas" w:hAnsi="Consolas"/>
-                <w:color w:val="24292E"/>
-                <w:sz w:val="19"/>
-              </w:rPr>
-              <w:t>@token_required</w:t>
-            </w:r>
-          </w:p>
-          <w:p>
-            <w:pPr>
-              <w:spacing w:line="252" w:lineRule="auto" w:after="40"/>
-            </w:pPr>
-            <w:r>
-              <w:rPr>
-                <w:rFonts w:ascii="Consolas" w:hAnsi="Consolas"/>
-                <w:color w:val="24292E"/>
-                <w:sz w:val="19"/>
-              </w:rPr>
-              <w:t>def get_image(id):</w:t>
-            </w:r>
-          </w:p>
-          <w:p>
-            <w:pPr>
-              <w:spacing w:line="252" w:lineRule="auto" w:after="40"/>
-            </w:pPr>
-            <w:r>
-              <w:rPr>
-                <w:rFonts w:ascii="Consolas" w:hAnsi="Consolas"/>
-                <w:color w:val="24292E"/>
-                <w:sz w:val="19"/>
-              </w:rPr>
-              <w:t xml:space="preserve">    # ต้องตรงทั้ง ID รูปภาพ และ user_id ของคนที่ล็อกอินอยู่เท่านั้น!</w:t>
-            </w:r>
-          </w:p>
-          <w:p>
-            <w:pPr>
-              <w:spacing w:line="252" w:lineRule="auto" w:after="40"/>
-            </w:pPr>
-            <w:r>
-              <w:rPr>
-                <w:rFonts w:ascii="Consolas" w:hAnsi="Consolas"/>
-                <w:color w:val="24292E"/>
-                <w:sz w:val="19"/>
-              </w:rPr>
-              <w:t xml:space="preserve">    gen = Generation.query.filter_by(id=id, user_id=request.user_id).first()</w:t>
-            </w:r>
-          </w:p>
-          <w:p>
-            <w:pPr>
-              <w:spacing w:line="252" w:lineRule="auto" w:after="40"/>
-            </w:pPr>
-            <w:r>
-              <w:rPr>
-                <w:rFonts w:ascii="Consolas" w:hAnsi="Consolas"/>
-                <w:color w:val="24292E"/>
-                <w:sz w:val="19"/>
-              </w:rPr>
-              <w:t xml:space="preserve">    if not gen or not gen.image_data:</w:t>
-            </w:r>
-          </w:p>
-          <w:p>
-            <w:pPr>
-              <w:spacing w:line="252" w:lineRule="auto" w:after="40"/>
-            </w:pPr>
-            <w:r>
-              <w:rPr>
-                <w:rFonts w:ascii="Consolas" w:hAnsi="Consolas"/>
-                <w:color w:val="24292E"/>
-                <w:sz w:val="19"/>
-              </w:rPr>
-              <w:t xml:space="preserve">        return error_response(GENERATION_NOT_FOUND, "Image not found", 404)</w:t>
-            </w:r>
-          </w:p>
-          <w:p>
-            <w:pPr>
-              <w:spacing w:line="252" w:lineRule="auto" w:after="40"/>
-            </w:pPr>
-            <w:r>
-              <w:rPr>
-                <w:rFonts w:ascii="Consolas" w:hAnsi="Consolas"/>
-                <w:color w:val="24292E"/>
-                <w:sz w:val="19"/>
-              </w:rPr>
-              <w:t xml:space="preserve">    return send_file(io.BytesIO(gen.image_data), mimetype="image/png")</w:t>
+              <w:t>ประกาศตัวแปรกลาง db = SQLAlchemy() เพื่อป้องกันปัญหา Circular Import</w:t>
             </w:r>
           </w:p>
         </w:tc>
       </w:tr>
-    </w:tbl>
-    <w:p/>
-    <w:p>
-      <w:pPr>
-        <w:pStyle w:val="Heading2"/>
-      </w:pPr>
-      <w:r>
-        <w:rPr>
-          <w:rFonts w:ascii="Cordia New" w:hAnsi="Cordia New"/>
-          <w:b/>
-          <w:color w:val="2F5597"/>
-          <w:sz w:val="32"/>
-        </w:rPr>
-        <w:t>2.3 ระบบเข้าคิว GPU กันการ์ดจอระเบิด (ai_client.py)</w:t>
-      </w:r>
-    </w:p>
-    <w:tbl>
-      <w:tblPr>
-        <w:tblW w:type="auto" w:w="0"/>
-        <w:jc w:val="center"/>
-        <w:tblLayout w:type="fixed"/>
-        <w:tblLook w:firstColumn="1" w:firstRow="1" w:lastColumn="0" w:lastRow="0" w:noHBand="0" w:noVBand="1" w:val="04A0"/>
-      </w:tblPr>
-      <w:tblGrid>
-        <w:gridCol w:w="9360"/>
-      </w:tblGrid>
       <w:tr>
         <w:tc>
           <w:tcPr>
-            <w:tcW w:type="dxa" w:w="9360"/>
-            <w:shd w:fill="EBF3FB"/>
+            <w:tcW w:type="dxa" w:w="3168"/>
             <w:tcMar>
-              <w:top w:w="100" w:type="dxa"/>
-              <w:bottom w:w="100" w:type="dxa"/>
-              <w:left w:w="150" w:type="dxa"/>
-              <w:right w:w="150" w:type="dxa"/>
+              <w:top w:w="80" w:type="dxa"/>
+              <w:bottom w:w="80" w:type="dxa"/>
+              <w:left w:w="120" w:type="dxa"/>
+              <w:right w:w="120" w:type="dxa"/>
+            </w:tcMar>
+            <w:shd w:fill="F2F2F2"/>
+          </w:tcPr>
+          <w:p>
+            <w:pPr>
+              <w:spacing w:line="276" w:lineRule="auto"/>
+            </w:pPr>
+            <w:r>
+              <w:rPr>
+                <w:rFonts w:ascii="Cordia New" w:hAnsi="Cordia New"/>
+                <w:b/>
+                <w:sz w:val="26"/>
+              </w:rPr>
+              <w:t>backend/app/models/user.py</w:t>
+            </w:r>
+          </w:p>
+        </w:tc>
+        <w:tc>
+          <w:tcPr>
+            <w:tcW w:type="dxa" w:w="6192"/>
+            <w:tcMar>
+              <w:top w:w="80" w:type="dxa"/>
+              <w:bottom w:w="80" w:type="dxa"/>
+              <w:left w:w="120" w:type="dxa"/>
+              <w:right w:w="120" w:type="dxa"/>
             </w:tcMar>
           </w:tcPr>
           <w:p>
@@ -1084,292 +422,98 @@
             <w:r>
               <w:rPr>
                 <w:rFonts w:ascii="Cordia New" w:hAnsi="Cordia New"/>
-                <w:b/>
-                <w:color w:val="1F4E79"/>
-                <w:sz w:val="28"/>
-              </w:rPr>
-              <w:t>💡 ภาษาคน: เหมือนห้องน้ำที่เข้าได้ทีละคนและต้องลงกลอนประตู (Mutex Lock)</w:t>
-              <w:br/>
-            </w:r>
-            <w:r>
-              <w:rPr>
-                <w:rFonts w:ascii="Cordia New" w:hAnsi="Cordia New"/>
-                <w:color w:val="333333"/>
                 <w:sz w:val="26"/>
               </w:rPr>
-              <w:t>การสร้างภาพ AI กินแรมการ์ดจอสูงมาก ถ้ามีคนกดพร้อมกัน 5 คนแล้วการ์ดจอยัดรวดเดียว แรม GPU จะระเบิด (Out of Memory) เราจึงใช้คำสั่ง _gpu_lock.acquire() เพื่อให้คนที่ 1 เข้าไปใช้และลงกลอนไว้ คนที่ 2, 3 ยืนรอคิวอย่างเป็นระเบียบ เมื่อทำเสร็จสั่ง _gpu_lock.release() ปลดกลอนให้คิวถัดไปทำต่อ งานจึงไม่หายและเซิร์ฟเวอร์ไม่พัง!</w:t>
+              <w:t>โมเดลตาราง users (id, email, password_hash, created_at) และผูก Cascade Delete ไปยังตารางภาพ</w:t>
             </w:r>
           </w:p>
         </w:tc>
       </w:tr>
-    </w:tbl>
-    <w:p/>
-    <w:tbl>
-      <w:tblPr>
-        <w:tblW w:type="auto" w:w="0"/>
-        <w:jc w:val="center"/>
-        <w:tblLayout w:type="fixed"/>
-        <w:tblLook w:firstColumn="1" w:firstRow="1" w:lastColumn="0" w:lastRow="0" w:noHBand="0" w:noVBand="1" w:val="04A0"/>
-      </w:tblPr>
-      <w:tblGrid>
-        <w:gridCol w:w="9360"/>
-      </w:tblGrid>
       <w:tr>
         <w:tc>
           <w:tcPr>
-            <w:tcW w:type="dxa" w:w="9360"/>
-            <w:shd w:fill="F4F5F7"/>
+            <w:tcW w:type="dxa" w:w="3168"/>
             <w:tcMar>
-              <w:top w:w="100" w:type="dxa"/>
-              <w:bottom w:w="100" w:type="dxa"/>
-              <w:left w:w="150" w:type="dxa"/>
-              <w:right w:w="150" w:type="dxa"/>
+              <w:top w:w="80" w:type="dxa"/>
+              <w:bottom w:w="80" w:type="dxa"/>
+              <w:left w:w="120" w:type="dxa"/>
+              <w:right w:w="120" w:type="dxa"/>
             </w:tcMar>
+            <w:shd w:fill="F2F2F2"/>
           </w:tcPr>
           <w:p>
             <w:pPr>
-              <w:spacing w:line="252" w:lineRule="auto" w:after="40"/>
+              <w:spacing w:line="276" w:lineRule="auto"/>
             </w:pPr>
             <w:r>
               <w:rPr>
-                <w:rFonts w:ascii="Consolas" w:hAnsi="Consolas"/>
-                <w:color w:val="24292E"/>
-                <w:sz w:val="19"/>
+                <w:rFonts w:ascii="Cordia New" w:hAnsi="Cordia New"/>
+                <w:b/>
+                <w:sz w:val="26"/>
               </w:rPr>
-              <w:t>_gpu_lock = threading.Lock() # ประตูกลอนห้องน้ำ GPU</w:t>
+              <w:t>backend/app/models/generation.py</w:t>
             </w:r>
           </w:p>
+        </w:tc>
+        <w:tc>
+          <w:tcPr>
+            <w:tcW w:type="dxa" w:w="6192"/>
+            <w:tcMar>
+              <w:top w:w="80" w:type="dxa"/>
+              <w:bottom w:w="80" w:type="dxa"/>
+              <w:left w:w="120" w:type="dxa"/>
+              <w:right w:w="120" w:type="dxa"/>
+            </w:tcMar>
+            <w:shd w:fill="FAFAFA"/>
+          </w:tcPr>
           <w:p>
             <w:pPr>
-              <w:spacing w:line="252" w:lineRule="auto" w:after="40"/>
+              <w:spacing w:line="276" w:lineRule="auto"/>
             </w:pPr>
             <w:r>
               <w:rPr>
-                <w:rFonts w:ascii="Consolas" w:hAnsi="Consolas"/>
-                <w:color w:val="24292E"/>
-                <w:sz w:val="19"/>
+                <w:rFonts w:ascii="Cordia New" w:hAnsi="Cordia New"/>
+                <w:sz w:val="26"/>
               </w:rPr>
-            </w:r>
-          </w:p>
-          <w:p>
-            <w:pPr>
-              <w:spacing w:line="252" w:lineRule="auto" w:after="40"/>
-            </w:pPr>
-            <w:r>
-              <w:rPr>
-                <w:rFonts w:ascii="Consolas" w:hAnsi="Consolas"/>
-                <w:color w:val="24292E"/>
-                <w:sz w:val="19"/>
-              </w:rPr>
-              <w:t>def generate_sd_image(payload: dict) -&gt; tuple:</w:t>
-            </w:r>
-          </w:p>
-          <w:p>
-            <w:pPr>
-              <w:spacing w:line="252" w:lineRule="auto" w:after="40"/>
-            </w:pPr>
-            <w:r>
-              <w:rPr>
-                <w:rFonts w:ascii="Consolas" w:hAnsi="Consolas"/>
-                <w:color w:val="24292E"/>
-                <w:sz w:val="19"/>
-              </w:rPr>
-              <w:t xml:space="preserve">    # 1. ยืนรอคิวขอใช้ GPU (รอได้สูงสุด 120 วินาที)</w:t>
-            </w:r>
-          </w:p>
-          <w:p>
-            <w:pPr>
-              <w:spacing w:line="252" w:lineRule="auto" w:after="40"/>
-            </w:pPr>
-            <w:r>
-              <w:rPr>
-                <w:rFonts w:ascii="Consolas" w:hAnsi="Consolas"/>
-                <w:color w:val="24292E"/>
-                <w:sz w:val="19"/>
-              </w:rPr>
-              <w:t xml:space="preserve">    lock_acquired = _gpu_lock.acquire(blocking=True, timeout=120)</w:t>
-            </w:r>
-          </w:p>
-          <w:p>
-            <w:pPr>
-              <w:spacing w:line="252" w:lineRule="auto" w:after="40"/>
-            </w:pPr>
-            <w:r>
-              <w:rPr>
-                <w:rFonts w:ascii="Consolas" w:hAnsi="Consolas"/>
-                <w:color w:val="24292E"/>
-                <w:sz w:val="19"/>
-              </w:rPr>
-              <w:t xml:space="preserve">    if not lock_acquired:</w:t>
-            </w:r>
-          </w:p>
-          <w:p>
-            <w:pPr>
-              <w:spacing w:line="252" w:lineRule="auto" w:after="40"/>
-            </w:pPr>
-            <w:r>
-              <w:rPr>
-                <w:rFonts w:ascii="Consolas" w:hAnsi="Consolas"/>
-                <w:color w:val="24292E"/>
-                <w:sz w:val="19"/>
-              </w:rPr>
-              <w:t xml:space="preserve">        raise AIServerBusyException("GPU Server is busy. Queue wait exceeded 120s.")</w:t>
-            </w:r>
-          </w:p>
-          <w:p>
-            <w:pPr>
-              <w:spacing w:line="252" w:lineRule="auto" w:after="40"/>
-            </w:pPr>
-            <w:r>
-              <w:rPr>
-                <w:rFonts w:ascii="Consolas" w:hAnsi="Consolas"/>
-                <w:color w:val="24292E"/>
-                <w:sz w:val="19"/>
-              </w:rPr>
-            </w:r>
-          </w:p>
-          <w:p>
-            <w:pPr>
-              <w:spacing w:line="252" w:lineRule="auto" w:after="40"/>
-            </w:pPr>
-            <w:r>
-              <w:rPr>
-                <w:rFonts w:ascii="Consolas" w:hAnsi="Consolas"/>
-                <w:color w:val="24292E"/>
-                <w:sz w:val="19"/>
-              </w:rPr>
-              <w:t xml:space="preserve">    try:</w:t>
-            </w:r>
-          </w:p>
-          <w:p>
-            <w:pPr>
-              <w:spacing w:line="252" w:lineRule="auto" w:after="40"/>
-            </w:pPr>
-            <w:r>
-              <w:rPr>
-                <w:rFonts w:ascii="Consolas" w:hAnsi="Consolas"/>
-                <w:color w:val="24292E"/>
-                <w:sz w:val="19"/>
-              </w:rPr>
-              <w:t xml:space="preserve">        # 2. เข้าใช้งาน GPU สั่งเจนภาพอย่างปลอดภัยทีละคน</w:t>
-            </w:r>
-          </w:p>
-          <w:p>
-            <w:pPr>
-              <w:spacing w:line="252" w:lineRule="auto" w:after="40"/>
-            </w:pPr>
-            <w:r>
-              <w:rPr>
-                <w:rFonts w:ascii="Consolas" w:hAnsi="Consolas"/>
-                <w:color w:val="24292E"/>
-                <w:sz w:val="19"/>
-              </w:rPr>
-              <w:t xml:space="preserve">        response = requests.post(f"{server_url}/sdapi/v1/txt2img", json=payload, timeout=75)</w:t>
-            </w:r>
-          </w:p>
-          <w:p>
-            <w:pPr>
-              <w:spacing w:line="252" w:lineRule="auto" w:after="40"/>
-            </w:pPr>
-            <w:r>
-              <w:rPr>
-                <w:rFonts w:ascii="Consolas" w:hAnsi="Consolas"/>
-                <w:color w:val="24292E"/>
-                <w:sz w:val="19"/>
-              </w:rPr>
-              <w:t xml:space="preserve">        base64_image = response.json()["images"][0]</w:t>
-            </w:r>
-          </w:p>
-          <w:p>
-            <w:pPr>
-              <w:spacing w:line="252" w:lineRule="auto" w:after="40"/>
-            </w:pPr>
-            <w:r>
-              <w:rPr>
-                <w:rFonts w:ascii="Consolas" w:hAnsi="Consolas"/>
-                <w:color w:val="24292E"/>
-                <w:sz w:val="19"/>
-              </w:rPr>
-              <w:t xml:space="preserve">        return base64_image</w:t>
-            </w:r>
-          </w:p>
-          <w:p>
-            <w:pPr>
-              <w:spacing w:line="252" w:lineRule="auto" w:after="40"/>
-            </w:pPr>
-            <w:r>
-              <w:rPr>
-                <w:rFonts w:ascii="Consolas" w:hAnsi="Consolas"/>
-                <w:color w:val="24292E"/>
-                <w:sz w:val="19"/>
-              </w:rPr>
-              <w:t xml:space="preserve">    finally:</w:t>
-            </w:r>
-          </w:p>
-          <w:p>
-            <w:pPr>
-              <w:spacing w:line="252" w:lineRule="auto" w:after="40"/>
-            </w:pPr>
-            <w:r>
-              <w:rPr>
-                <w:rFonts w:ascii="Consolas" w:hAnsi="Consolas"/>
-                <w:color w:val="24292E"/>
-                <w:sz w:val="19"/>
-              </w:rPr>
-              <w:t xml:space="preserve">        # 3. จุดสำคัญที่สุด: ต้องปลดล็อกประตูเสมอเมื่อทำเสร็จ ให้คิวถัดไปได้เข้าต่อ!</w:t>
-            </w:r>
-          </w:p>
-          <w:p>
-            <w:pPr>
-              <w:spacing w:line="252" w:lineRule="auto" w:after="40"/>
-            </w:pPr>
-            <w:r>
-              <w:rPr>
-                <w:rFonts w:ascii="Consolas" w:hAnsi="Consolas"/>
-                <w:color w:val="24292E"/>
-                <w:sz w:val="19"/>
-              </w:rPr>
-              <w:t xml:space="preserve">        _gpu_lock.release()</w:t>
+              <w:t>โมเดลตาราง generations รองรับประวัติ 2 หมวดหมู่ (sd_generate และ image_filter) และเก็บไฟล์ภาพเป็น BLOB</w:t>
             </w:r>
           </w:p>
         </w:tc>
       </w:tr>
-    </w:tbl>
-    <w:p/>
-    <w:p>
-      <w:pPr>
-        <w:pStyle w:val="Heading2"/>
-      </w:pPr>
-      <w:r>
-        <w:rPr>
-          <w:rFonts w:ascii="Cordia New" w:hAnsi="Cordia New"/>
-          <w:b/>
-          <w:color w:val="2F5597"/>
-          <w:sz w:val="32"/>
-        </w:rPr>
-        <w:t>2.4 ระบบแฮชรหัสผ่านอย่างปลอดภัย (auth.py)</w:t>
-      </w:r>
-    </w:p>
-    <w:tbl>
-      <w:tblPr>
-        <w:tblW w:type="auto" w:w="0"/>
-        <w:jc w:val="center"/>
-        <w:tblLayout w:type="fixed"/>
-        <w:tblLook w:firstColumn="1" w:firstRow="1" w:lastColumn="0" w:lastRow="0" w:noHBand="0" w:noVBand="1" w:val="04A0"/>
-      </w:tblPr>
-      <w:tblGrid>
-        <w:gridCol w:w="9360"/>
-      </w:tblGrid>
       <w:tr>
         <w:tc>
           <w:tcPr>
-            <w:tcW w:type="dxa" w:w="9360"/>
-            <w:shd w:fill="EBF3FB"/>
+            <w:tcW w:type="dxa" w:w="3168"/>
             <w:tcMar>
-              <w:top w:w="100" w:type="dxa"/>
-              <w:bottom w:w="100" w:type="dxa"/>
-              <w:left w:w="150" w:type="dxa"/>
-              <w:right w:w="150" w:type="dxa"/>
+              <w:top w:w="80" w:type="dxa"/>
+              <w:bottom w:w="80" w:type="dxa"/>
+              <w:left w:w="120" w:type="dxa"/>
+              <w:right w:w="120" w:type="dxa"/>
+            </w:tcMar>
+            <w:shd w:fill="F2F2F2"/>
+          </w:tcPr>
+          <w:p>
+            <w:pPr>
+              <w:spacing w:line="276" w:lineRule="auto"/>
+            </w:pPr>
+            <w:r>
+              <w:rPr>
+                <w:rFonts w:ascii="Cordia New" w:hAnsi="Cordia New"/>
+                <w:b/>
+                <w:sz w:val="26"/>
+              </w:rPr>
+              <w:t>backend/app/middleware/jwt_auth.py</w:t>
+            </w:r>
+          </w:p>
+        </w:tc>
+        <w:tc>
+          <w:tcPr>
+            <w:tcW w:type="dxa" w:w="6192"/>
+            <w:tcMar>
+              <w:top w:w="80" w:type="dxa"/>
+              <w:bottom w:w="80" w:type="dxa"/>
+              <w:left w:w="120" w:type="dxa"/>
+              <w:right w:w="120" w:type="dxa"/>
             </w:tcMar>
           </w:tcPr>
           <w:p>
@@ -1379,188 +523,312 @@
             <w:r>
               <w:rPr>
                 <w:rFonts w:ascii="Cordia New" w:hAnsi="Cordia New"/>
-                <w:b/>
-                <w:color w:val="1F4E79"/>
-                <w:sz w:val="28"/>
-              </w:rPr>
-              <w:t>💡 ภาษาคน: เครื่องปั่นละเอียดที่ไม่มีทางย้อนกลับ</w:t>
-              <w:br/>
-            </w:r>
-            <w:r>
-              <w:rPr>
-                <w:rFonts w:ascii="Cordia New" w:hAnsi="Cordia New"/>
-                <w:color w:val="333333"/>
                 <w:sz w:val="26"/>
               </w:rPr>
-              <w:t>ห้ามเก็บรหัสผ่านจริงลงฐานข้อมูลเด็ดขาด! เราใช้ generate_password_hash() ปั่นรหัสผ่านกับเกลือสุ่ม (Salt) จนกลายเป็นผงแฮชยึกยือยาว ๆ ที่ไม่มีใครย้อนกลับเป็นรหัสเดิมได้ ตอนล็อกอินก็นำคำที่พิมพ์ไปปั่นแบบเดียวกันแล้วเทียบผลลัพธ์ผ่าน check_password_hash()</w:t>
+              <w:t>มิดเดิลแวร์ @token_required ตรวจสอบ Bearer JWT Token, ถอดรหัส user_id และป้องกันการข้ามสิทธิ์</w:t>
             </w:r>
           </w:p>
         </w:tc>
       </w:tr>
-    </w:tbl>
-    <w:p/>
-    <w:tbl>
-      <w:tblPr>
-        <w:tblW w:type="auto" w:w="0"/>
-        <w:jc w:val="center"/>
-        <w:tblLayout w:type="fixed"/>
-        <w:tblLook w:firstColumn="1" w:firstRow="1" w:lastColumn="0" w:lastRow="0" w:noHBand="0" w:noVBand="1" w:val="04A0"/>
-      </w:tblPr>
-      <w:tblGrid>
-        <w:gridCol w:w="9360"/>
-      </w:tblGrid>
       <w:tr>
         <w:tc>
           <w:tcPr>
-            <w:tcW w:type="dxa" w:w="9360"/>
-            <w:shd w:fill="F4F5F7"/>
+            <w:tcW w:type="dxa" w:w="3168"/>
             <w:tcMar>
-              <w:top w:w="100" w:type="dxa"/>
-              <w:bottom w:w="100" w:type="dxa"/>
-              <w:left w:w="150" w:type="dxa"/>
-              <w:right w:w="150" w:type="dxa"/>
+              <w:top w:w="80" w:type="dxa"/>
+              <w:bottom w:w="80" w:type="dxa"/>
+              <w:left w:w="120" w:type="dxa"/>
+              <w:right w:w="120" w:type="dxa"/>
+            </w:tcMar>
+            <w:shd w:fill="F2F2F2"/>
+          </w:tcPr>
+          <w:p>
+            <w:pPr>
+              <w:spacing w:line="276" w:lineRule="auto"/>
+            </w:pPr>
+            <w:r>
+              <w:rPr>
+                <w:rFonts w:ascii="Cordia New" w:hAnsi="Cordia New"/>
+                <w:b/>
+                <w:sz w:val="26"/>
+              </w:rPr>
+              <w:t>backend/app/routes/auth.py</w:t>
+            </w:r>
+          </w:p>
+        </w:tc>
+        <w:tc>
+          <w:tcPr>
+            <w:tcW w:type="dxa" w:w="6192"/>
+            <w:tcMar>
+              <w:top w:w="80" w:type="dxa"/>
+              <w:bottom w:w="80" w:type="dxa"/>
+              <w:left w:w="120" w:type="dxa"/>
+              <w:right w:w="120" w:type="dxa"/>
+            </w:tcMar>
+            <w:shd w:fill="FAFAFA"/>
+          </w:tcPr>
+          <w:p>
+            <w:pPr>
+              <w:spacing w:line="276" w:lineRule="auto"/>
+            </w:pPr>
+            <w:r>
+              <w:rPr>
+                <w:rFonts w:ascii="Cordia New" w:hAnsi="Cordia New"/>
+                <w:sz w:val="26"/>
+              </w:rPr>
+              <w:t>เส้นทาง /register (สมัครสมาชิก, ตรวจเมลซ้ำ, แฮชรหัสผ่าน) และ /login (ตรวจสอบรหัสผ่าน, ออก JWT Token)</w:t>
+            </w:r>
+          </w:p>
+        </w:tc>
+      </w:tr>
+      <w:tr>
+        <w:tc>
+          <w:tcPr>
+            <w:tcW w:type="dxa" w:w="3168"/>
+            <w:tcMar>
+              <w:top w:w="80" w:type="dxa"/>
+              <w:bottom w:w="80" w:type="dxa"/>
+              <w:left w:w="120" w:type="dxa"/>
+              <w:right w:w="120" w:type="dxa"/>
+            </w:tcMar>
+            <w:shd w:fill="F2F2F2"/>
+          </w:tcPr>
+          <w:p>
+            <w:pPr>
+              <w:spacing w:line="276" w:lineRule="auto"/>
+            </w:pPr>
+            <w:r>
+              <w:rPr>
+                <w:rFonts w:ascii="Cordia New" w:hAnsi="Cordia New"/>
+                <w:b/>
+                <w:sz w:val="26"/>
+              </w:rPr>
+              <w:t>backend/app/routes/sd.py</w:t>
+            </w:r>
+          </w:p>
+        </w:tc>
+        <w:tc>
+          <w:tcPr>
+            <w:tcW w:type="dxa" w:w="6192"/>
+            <w:tcMar>
+              <w:top w:w="80" w:type="dxa"/>
+              <w:bottom w:w="80" w:type="dxa"/>
+              <w:left w:w="120" w:type="dxa"/>
+              <w:right w:w="120" w:type="dxa"/>
             </w:tcMar>
           </w:tcPr>
           <w:p>
             <w:pPr>
-              <w:spacing w:line="252" w:lineRule="auto" w:after="40"/>
+              <w:spacing w:line="276" w:lineRule="auto"/>
             </w:pPr>
             <w:r>
               <w:rPr>
-                <w:rFonts w:ascii="Consolas" w:hAnsi="Consolas"/>
-                <w:color w:val="24292E"/>
-                <w:sz w:val="19"/>
+                <w:rFonts w:ascii="Cordia New" w:hAnsi="Cordia New"/>
+                <w:sz w:val="26"/>
               </w:rPr>
-              <w:t># สมัครสมาชิก: ปั่นรหัสผ่านก่อนบันทึกลง SQLite</w:t>
+              <w:t>เส้นทาง /generate (สร้างภาพ AI), /estimate (ประเมินเวลา), /images/:id (สตรีมภาพ PNG พร้อมเช็กเจ้าของ)</w:t>
             </w:r>
           </w:p>
+        </w:tc>
+      </w:tr>
+      <w:tr>
+        <w:tc>
+          <w:tcPr>
+            <w:tcW w:type="dxa" w:w="3168"/>
+            <w:tcMar>
+              <w:top w:w="80" w:type="dxa"/>
+              <w:bottom w:w="80" w:type="dxa"/>
+              <w:left w:w="120" w:type="dxa"/>
+              <w:right w:w="120" w:type="dxa"/>
+            </w:tcMar>
+            <w:shd w:fill="F2F2F2"/>
+          </w:tcPr>
           <w:p>
             <w:pPr>
-              <w:spacing w:line="252" w:lineRule="auto" w:after="40"/>
+              <w:spacing w:line="276" w:lineRule="auto"/>
             </w:pPr>
             <w:r>
               <w:rPr>
-                <w:rFonts w:ascii="Consolas" w:hAnsi="Consolas"/>
-                <w:color w:val="24292E"/>
-                <w:sz w:val="19"/>
+                <w:rFonts w:ascii="Cordia New" w:hAnsi="Cordia New"/>
+                <w:b/>
+                <w:sz w:val="26"/>
               </w:rPr>
-              <w:t>hashed = generate_password_hash(password) # PBKDF2/SHA256</w:t>
+              <w:t>backend/app/routes/history.py</w:t>
             </w:r>
           </w:p>
+        </w:tc>
+        <w:tc>
+          <w:tcPr>
+            <w:tcW w:type="dxa" w:w="6192"/>
+            <w:tcMar>
+              <w:top w:w="80" w:type="dxa"/>
+              <w:bottom w:w="80" w:type="dxa"/>
+              <w:left w:w="120" w:type="dxa"/>
+              <w:right w:w="120" w:type="dxa"/>
+            </w:tcMar>
+            <w:shd w:fill="FAFAFA"/>
+          </w:tcPr>
           <w:p>
             <w:pPr>
-              <w:spacing w:line="252" w:lineRule="auto" w:after="40"/>
+              <w:spacing w:line="276" w:lineRule="auto"/>
             </w:pPr>
             <w:r>
               <w:rPr>
-                <w:rFonts w:ascii="Consolas" w:hAnsi="Consolas"/>
-                <w:color w:val="24292E"/>
-                <w:sz w:val="19"/>
+                <w:rFonts w:ascii="Cordia New" w:hAnsi="Cordia New"/>
+                <w:sz w:val="26"/>
               </w:rPr>
-              <w:t>user = User(email=email, password_hash=hashed)</w:t>
+              <w:t>เส้นทาง /history (ดึงประวัติพร้อม Pagination &amp; Filter), ดูรายละเอียดภาพ, และลบประวัติของตนเอง</w:t>
             </w:r>
           </w:p>
+        </w:tc>
+      </w:tr>
+      <w:tr>
+        <w:tc>
+          <w:tcPr>
+            <w:tcW w:type="dxa" w:w="3168"/>
+            <w:tcMar>
+              <w:top w:w="80" w:type="dxa"/>
+              <w:bottom w:w="80" w:type="dxa"/>
+              <w:left w:w="120" w:type="dxa"/>
+              <w:right w:w="120" w:type="dxa"/>
+            </w:tcMar>
+            <w:shd w:fill="F2F2F2"/>
+          </w:tcPr>
           <w:p>
             <w:pPr>
-              <w:spacing w:line="252" w:lineRule="auto" w:after="40"/>
+              <w:spacing w:line="276" w:lineRule="auto"/>
             </w:pPr>
             <w:r>
               <w:rPr>
-                <w:rFonts w:ascii="Consolas" w:hAnsi="Consolas"/>
-                <w:color w:val="24292E"/>
-                <w:sz w:val="19"/>
+                <w:rFonts w:ascii="Cordia New" w:hAnsi="Cordia New"/>
+                <w:b/>
+                <w:sz w:val="26"/>
               </w:rPr>
-              <w:t>db.session.add(user)</w:t>
+              <w:t>backend/app/routes/profile.py</w:t>
             </w:r>
           </w:p>
+        </w:tc>
+        <w:tc>
+          <w:tcPr>
+            <w:tcW w:type="dxa" w:w="6192"/>
+            <w:tcMar>
+              <w:top w:w="80" w:type="dxa"/>
+              <w:bottom w:w="80" w:type="dxa"/>
+              <w:left w:w="120" w:type="dxa"/>
+              <w:right w:w="120" w:type="dxa"/>
+            </w:tcMar>
+          </w:tcPr>
           <w:p>
             <w:pPr>
-              <w:spacing w:line="252" w:lineRule="auto" w:after="40"/>
+              <w:spacing w:line="276" w:lineRule="auto"/>
             </w:pPr>
             <w:r>
               <w:rPr>
-                <w:rFonts w:ascii="Consolas" w:hAnsi="Consolas"/>
-                <w:color w:val="24292E"/>
-                <w:sz w:val="19"/>
+                <w:rFonts w:ascii="Cordia New" w:hAnsi="Cordia New"/>
+                <w:sz w:val="26"/>
               </w:rPr>
-              <w:t>db.session.commit()</w:t>
+              <w:t>เส้นทาง /profile ดึงข้อมูลส่วนตัวผู้ใช้ และสรุปยอดจำนวนภาพที่สร้างแยกตามประเภท</w:t>
             </w:r>
           </w:p>
+        </w:tc>
+      </w:tr>
+      <w:tr>
+        <w:tc>
+          <w:tcPr>
+            <w:tcW w:type="dxa" w:w="3168"/>
+            <w:tcMar>
+              <w:top w:w="80" w:type="dxa"/>
+              <w:bottom w:w="80" w:type="dxa"/>
+              <w:left w:w="120" w:type="dxa"/>
+              <w:right w:w="120" w:type="dxa"/>
+            </w:tcMar>
+            <w:shd w:fill="F2F2F2"/>
+          </w:tcPr>
           <w:p>
             <w:pPr>
-              <w:spacing w:line="252" w:lineRule="auto" w:after="40"/>
+              <w:spacing w:line="276" w:lineRule="auto"/>
             </w:pPr>
             <w:r>
               <w:rPr>
-                <w:rFonts w:ascii="Consolas" w:hAnsi="Consolas"/>
-                <w:color w:val="24292E"/>
-                <w:sz w:val="19"/>
+                <w:rFonts w:ascii="Cordia New" w:hAnsi="Cordia New"/>
+                <w:b/>
+                <w:sz w:val="26"/>
               </w:rPr>
+              <w:t>backend/app/services/ai_client.py</w:t>
             </w:r>
           </w:p>
+        </w:tc>
+        <w:tc>
+          <w:tcPr>
+            <w:tcW w:type="dxa" w:w="6192"/>
+            <w:tcMar>
+              <w:top w:w="80" w:type="dxa"/>
+              <w:bottom w:w="80" w:type="dxa"/>
+              <w:left w:w="120" w:type="dxa"/>
+              <w:right w:w="120" w:type="dxa"/>
+            </w:tcMar>
+            <w:shd w:fill="FAFAFA"/>
+          </w:tcPr>
           <w:p>
             <w:pPr>
-              <w:spacing w:line="252" w:lineRule="auto" w:after="40"/>
+              <w:spacing w:line="276" w:lineRule="auto"/>
             </w:pPr>
             <w:r>
               <w:rPr>
-                <w:rFonts w:ascii="Consolas" w:hAnsi="Consolas"/>
-                <w:color w:val="24292E"/>
-                <w:sz w:val="19"/>
+                <w:rFonts w:ascii="Cordia New" w:hAnsi="Cordia New"/>
+                <w:sz w:val="26"/>
               </w:rPr>
-              <w:t># ล็อกอิน: เอาคำที่พิมพ์มาตรวจกับแฮชเดิม</w:t>
+              <w:t>ตัวเชื่อมต่อ AI Server มีระบบ Concurrency Queue (GPU Lock) และระบบคำนวณเวลาโดยประมาณ</w:t>
             </w:r>
           </w:p>
+        </w:tc>
+      </w:tr>
+      <w:tr>
+        <w:tc>
+          <w:tcPr>
+            <w:tcW w:type="dxa" w:w="3168"/>
+            <w:tcMar>
+              <w:top w:w="80" w:type="dxa"/>
+              <w:bottom w:w="80" w:type="dxa"/>
+              <w:left w:w="120" w:type="dxa"/>
+              <w:right w:w="120" w:type="dxa"/>
+            </w:tcMar>
+            <w:shd w:fill="F2F2F2"/>
+          </w:tcPr>
           <w:p>
             <w:pPr>
-              <w:spacing w:line="252" w:lineRule="auto" w:after="40"/>
+              <w:spacing w:line="276" w:lineRule="auto"/>
             </w:pPr>
             <w:r>
               <w:rPr>
-                <w:rFonts w:ascii="Consolas" w:hAnsi="Consolas"/>
-                <w:color w:val="24292E"/>
-                <w:sz w:val="19"/>
+                <w:rFonts w:ascii="Cordia New" w:hAnsi="Cordia New"/>
+                <w:b/>
+                <w:sz w:val="26"/>
               </w:rPr>
-              <w:t>if not user or not check_password_hash(user.password_hash, password):</w:t>
+              <w:t>backend/app/utils/error_codes.py</w:t>
             </w:r>
           </w:p>
+        </w:tc>
+        <w:tc>
+          <w:tcPr>
+            <w:tcW w:type="dxa" w:w="6192"/>
+            <w:tcMar>
+              <w:top w:w="80" w:type="dxa"/>
+              <w:bottom w:w="80" w:type="dxa"/>
+              <w:left w:w="120" w:type="dxa"/>
+              <w:right w:w="120" w:type="dxa"/>
+            </w:tcMar>
+          </w:tcPr>
           <w:p>
             <w:pPr>
-              <w:spacing w:line="252" w:lineRule="auto" w:after="40"/>
+              <w:spacing w:line="276" w:lineRule="auto"/>
             </w:pPr>
             <w:r>
               <w:rPr>
-                <w:rFonts w:ascii="Consolas" w:hAnsi="Consolas"/>
-                <w:color w:val="24292E"/>
-                <w:sz w:val="19"/>
+                <w:rFonts w:ascii="Cordia New" w:hAnsi="Cordia New"/>
+                <w:sz w:val="26"/>
               </w:rPr>
-              <w:t xml:space="preserve">    return error_response(INVALID_CREDENTIALS, "Invalid email or password", 401)</w:t>
-            </w:r>
-          </w:p>
-          <w:p>
-            <w:pPr>
-              <w:spacing w:line="252" w:lineRule="auto" w:after="40"/>
-            </w:pPr>
-            <w:r>
-              <w:rPr>
-                <w:rFonts w:ascii="Consolas" w:hAnsi="Consolas"/>
-                <w:color w:val="24292E"/>
-                <w:sz w:val="19"/>
-              </w:rPr>
-              <w:t># ถูกต้อง -&gt; ออกบัตร JWT Token อายุ 24 ชั่วโมง</w:t>
-            </w:r>
-          </w:p>
-          <w:p>
-            <w:pPr>
-              <w:spacing w:line="252" w:lineRule="auto" w:after="40"/>
-            </w:pPr>
-            <w:r>
-              <w:rPr>
-                <w:rFonts w:ascii="Consolas" w:hAnsi="Consolas"/>
-                <w:color w:val="24292E"/>
-                <w:sz w:val="19"/>
-              </w:rPr>
-              <w:t>token = jwt.encode({"user_id": user.id, "exp": now + 24h}, secret, algorithm="HS256")</w:t>
+              <w:t>ฟังก์ชันห่อ Response Format (success_response, error_response) และนิยาม Error Codes มาตรฐาน</w:t>
             </w:r>
           </w:p>
         </w:tc>
@@ -1578,7 +846,375 @@
           <w:color w:val="1F4E79"/>
           <w:sz w:val="36"/>
         </w:rPr>
-        <w:t>3. สรุปรายการ API Endpoints ทั้งหมดในระบบ</w:t>
+        <w:t>3. เจาะลึกกระบวนการทำงานและเส้นทางข้อมูล (Step-by-Step Data Flow)</w:t>
+      </w:r>
+    </w:p>
+    <w:p>
+      <w:pPr>
+        <w:pStyle w:val="Heading2"/>
+      </w:pPr>
+      <w:r>
+        <w:rPr>
+          <w:rFonts w:ascii="Cordia New" w:hAnsi="Cordia New"/>
+          <w:b/>
+          <w:color w:val="2F5597"/>
+          <w:sz w:val="32"/>
+        </w:rPr>
+        <w:t>3.1 การสมัครสมาชิก (Register Flow)</w:t>
+      </w:r>
+    </w:p>
+    <w:p>
+      <w:pPr>
+        <w:pStyle w:val="ListBullet"/>
+      </w:pPr>
+      <w:r>
+        <w:rPr>
+          <w:b/>
+        </w:rPr>
+        <w:t xml:space="preserve">1. ผู้ใช้กรอกข้อมูลบน Frontend: </w:t>
+      </w:r>
+      <w:r>
+        <w:t>กรอก email และ password แล้วกดปุ่ม Register จากนั้น Frontend ส่งคำขอ POST /api/v1/register พร้อม Body JSON {'email': 'peem@example.com', 'password': 'Password123'}</w:t>
+      </w:r>
+    </w:p>
+    <w:p>
+      <w:pPr>
+        <w:pStyle w:val="ListBullet"/>
+      </w:pPr>
+      <w:r>
+        <w:rPr>
+          <w:b/>
+        </w:rPr>
+        <w:t xml:space="preserve">2. Backend Validation: </w:t>
+      </w:r>
+      <w:r>
+        <w:t>ฟังก์ชัน auth.py รับข้อมูล ตรวจสอบรูปแบบอีเมลด้วย Regex และตรวจความยาวรหัสผ่าน (ต้อง &gt;= 8 ตัวอักษร)</w:t>
+      </w:r>
+    </w:p>
+    <w:p>
+      <w:pPr>
+        <w:pStyle w:val="ListBullet"/>
+      </w:pPr>
+      <w:r>
+        <w:rPr>
+          <w:b/>
+        </w:rPr>
+        <w:t xml:space="preserve">3. Duplicate Check (ตรวจอีเมลซ้ำ): </w:t>
+      </w:r>
+      <w:r>
+        <w:t>ค้นหาในตาราง users ด้วยคำสั่ง User.query.filter_by(email=email).first() หากพบว่ามีอยู่แล้ว จะตอบกลับ HTTP 409 EMAIL_EXISTS</w:t>
+      </w:r>
+    </w:p>
+    <w:p>
+      <w:pPr>
+        <w:pStyle w:val="ListBullet"/>
+      </w:pPr>
+      <w:r>
+        <w:rPr>
+          <w:b/>
+        </w:rPr>
+        <w:t xml:space="preserve">4. Password Hashing: </w:t>
+      </w:r>
+      <w:r>
+        <w:t>นำรหัสผ่านไปผ่านฟังก์ชัน generate_password_hash() เพื่อแปลงเป็นแฮช PBKDF2/SHA256 ที่ปลอดภัย ไม่เก็บรหัสผ่านจริง</w:t>
+      </w:r>
+    </w:p>
+    <w:p>
+      <w:pPr>
+        <w:pStyle w:val="ListBullet"/>
+      </w:pPr>
+      <w:r>
+        <w:rPr>
+          <w:b/>
+        </w:rPr>
+        <w:t xml:space="preserve">5. บันทึกลงฐานข้อมูล: </w:t>
+      </w:r>
+      <w:r>
+        <w:t>สร้าง User object ใหม่แล้วบันทึก (db.session.add(new_user) -&gt; db.session.commit())</w:t>
+      </w:r>
+    </w:p>
+    <w:p>
+      <w:pPr>
+        <w:pStyle w:val="ListBullet"/>
+      </w:pPr>
+      <w:r>
+        <w:rPr>
+          <w:b/>
+        </w:rPr>
+        <w:t xml:space="preserve">6. ส่ง Response กลับ Frontend: </w:t>
+      </w:r>
+      <w:r>
+        <w:t>ส่งรหัสสถานะ HTTP 201 Created พร้อมข้อมูลผู้ใช้ในรูปแบบ JSON เพื่อให้ Frontend พาไปยังหน้า Login</w:t>
+      </w:r>
+    </w:p>
+    <w:p/>
+    <w:p>
+      <w:pPr>
+        <w:pStyle w:val="Heading2"/>
+      </w:pPr>
+      <w:r>
+        <w:rPr>
+          <w:rFonts w:ascii="Cordia New" w:hAnsi="Cordia New"/>
+          <w:b/>
+          <w:color w:val="2F5597"/>
+          <w:sz w:val="32"/>
+        </w:rPr>
+        <w:t>3.2 การเข้าสู่ระบบและออก JWT Token (Login Flow)</w:t>
+      </w:r>
+    </w:p>
+    <w:p>
+      <w:pPr>
+        <w:pStyle w:val="ListBullet"/>
+      </w:pPr>
+      <w:r>
+        <w:rPr>
+          <w:b/>
+        </w:rPr>
+        <w:t xml:space="preserve">1. ผู้ใช้ส่งคำขอ Login: </w:t>
+      </w:r>
+      <w:r>
+        <w:t>Frontend ส่งคำขอ POST /api/v1/login พร้อม email และ password</w:t>
+      </w:r>
+    </w:p>
+    <w:p>
+      <w:pPr>
+        <w:pStyle w:val="ListBullet"/>
+      </w:pPr>
+      <w:r>
+        <w:rPr>
+          <w:b/>
+        </w:rPr>
+        <w:t xml:space="preserve">2. ตรวจสอบบัญชีและรหัสผ่าน: </w:t>
+      </w:r>
+      <w:r>
+        <w:t>ค้นหา User ด้วย email หากพบจะนำรหัสผ่านไปตรวจกับค่า Hash ด้วย check_password_hash(user.password_hash, password) หากไม่ตรงจะตอบกลับ HTTP 401 INVALID_CREDENTIALS</w:t>
+      </w:r>
+    </w:p>
+    <w:p>
+      <w:pPr>
+        <w:pStyle w:val="ListBullet"/>
+      </w:pPr>
+      <w:r>
+        <w:rPr>
+          <w:b/>
+        </w:rPr>
+        <w:t xml:space="preserve">3. สร้าง JWT Access Token: </w:t>
+      </w:r>
+      <w:r>
+        <w:t>สร้าง Payload บรรจุ {'user_id': user.id, 'email': user.email, 'exp': now + 24 ชั่วโมง} และเข้ารหัสด้วย Secret Key (HS256)</w:t>
+      </w:r>
+    </w:p>
+    <w:p>
+      <w:pPr>
+        <w:pStyle w:val="ListBullet"/>
+      </w:pPr>
+      <w:r>
+        <w:rPr>
+          <w:b/>
+        </w:rPr>
+        <w:t xml:space="preserve">4. ส่ง Token กลับ Frontend: </w:t>
+      </w:r>
+      <w:r>
+        <w:t>ส่ง JSON ตอบกลับพร้อม access_token ให้ Frontend จัดเก็บใน localStorage สำหรับใช้แนบกับคำขออื่นๆ</w:t>
+      </w:r>
+    </w:p>
+    <w:p/>
+    <w:p>
+      <w:pPr>
+        <w:pStyle w:val="Heading2"/>
+      </w:pPr>
+      <w:r>
+        <w:rPr>
+          <w:rFonts w:ascii="Cordia New" w:hAnsi="Cordia New"/>
+          <w:b/>
+          <w:color w:val="2F5597"/>
+          <w:sz w:val="32"/>
+        </w:rPr>
+        <w:t>3.3 การสร้างรูปภาพด้วย AI (Image Generation Flow)</w:t>
+      </w:r>
+    </w:p>
+    <w:p>
+      <w:pPr>
+        <w:pStyle w:val="ListBullet"/>
+      </w:pPr>
+      <w:r>
+        <w:rPr>
+          <w:b/>
+        </w:rPr>
+        <w:t xml:space="preserve">1. Frontend สั่งสร้างภาพ: </w:t>
+      </w:r>
+      <w:r>
+        <w:t>ส่งคำขอ POST /api/v1/generate พร้อม Header 'Authorization: Bearer &lt;Token&gt;' และพารามิเตอร์ Prompt, Size, Steps, Sampler</w:t>
+      </w:r>
+    </w:p>
+    <w:p>
+      <w:pPr>
+        <w:pStyle w:val="ListBullet"/>
+      </w:pPr>
+      <w:r>
+        <w:rPr>
+          <w:b/>
+        </w:rPr>
+        <w:t xml:space="preserve">2. Middleware ตรวจสอบสิทธิ์: </w:t>
+      </w:r>
+      <w:r>
+        <w:t>มิดเดิลแวร์ @token_required ถอดรหัส Token และสกัด user_id ของผู้ใช้ปัจจุบันเก็บไว้ใน request.user_id</w:t>
+      </w:r>
+    </w:p>
+    <w:p>
+      <w:pPr>
+        <w:pStyle w:val="ListBullet"/>
+      </w:pPr>
+      <w:r>
+        <w:rPr>
+          <w:b/>
+        </w:rPr>
+        <w:t xml:space="preserve">3. Concurrency Queue (GPU Lock): </w:t>
+      </w:r>
+      <w:r>
+        <w:t>คำขอเข้าสู่คิว ai_client.py ซึ่งมี Mutex Lock (_gpu_lock.acquire()) เพื่อให้ GPU ทำงานทีละ 1 งานอย่างปลอดภัย ไม่เกิดปัญหาคิวชนกัน</w:t>
+      </w:r>
+    </w:p>
+    <w:p>
+      <w:pPr>
+        <w:pStyle w:val="ListBullet"/>
+      </w:pPr>
+      <w:r>
+        <w:rPr>
+          <w:b/>
+        </w:rPr>
+        <w:t xml:space="preserve">4. ส่งคำขอไปยัง AI Server: </w:t>
+      </w:r>
+      <w:r>
+        <w:t>ยิง HTTP POST ไปที่ Stable Diffusion WebUI API (/sdapi/v1/txt2img) รอรับผลลัพธ์ภาพแบบ Base64 String</w:t>
+      </w:r>
+    </w:p>
+    <w:p>
+      <w:pPr>
+        <w:pStyle w:val="ListBullet"/>
+      </w:pPr>
+      <w:r>
+        <w:rPr>
+          <w:b/>
+        </w:rPr>
+        <w:t xml:space="preserve">5. ปลดล็อกคิว GPU: </w:t>
+      </w:r>
+      <w:r>
+        <w:t>สั่ง _gpu_lock.release() ทันทีเพื่อให้คำขอถัดไปในคิวเริ่มทำงานต่อได้</w:t>
+      </w:r>
+    </w:p>
+    <w:p>
+      <w:pPr>
+        <w:pStyle w:val="ListBullet"/>
+      </w:pPr>
+      <w:r>
+        <w:rPr>
+          <w:b/>
+        </w:rPr>
+        <w:t xml:space="preserve">6. บันทึกรูปภาพลง SQLite (BLOB): </w:t>
+      </w:r>
+      <w:r>
+        <w:t>แปลง Base64 เป็น Binary Bytes แล้วบันทึกลงตาราง generations ผูกกับ user_id และระบุ category='sd_generate'</w:t>
+      </w:r>
+    </w:p>
+    <w:p>
+      <w:pPr>
+        <w:pStyle w:val="ListBullet"/>
+      </w:pPr>
+      <w:r>
+        <w:rPr>
+          <w:b/>
+        </w:rPr>
+        <w:t xml:space="preserve">7. ตอบกลับผลลัพธ์: </w:t>
+      </w:r>
+      <w:r>
+        <w:t>ส่ง JSON ตอบกลับพร้อม generation_id และ URL /api/v1/images/:id ให้ Frontend นำไปแสดงผล</w:t>
+      </w:r>
+    </w:p>
+    <w:p/>
+    <w:p>
+      <w:pPr>
+        <w:pStyle w:val="Heading2"/>
+      </w:pPr>
+      <w:r>
+        <w:rPr>
+          <w:rFonts w:ascii="Cordia New" w:hAnsi="Cordia New"/>
+          <w:b/>
+          <w:color w:val="2F5597"/>
+          <w:sz w:val="32"/>
+        </w:rPr>
+        <w:t>3.4 การเปิดดูรูปภาพและระบบป้องกันการข้ามสิทธิ์ (IDOR / Anti-Hopping Protection)</w:t>
+      </w:r>
+    </w:p>
+    <w:p>
+      <w:pPr>
+        <w:pStyle w:val="ListBullet"/>
+      </w:pPr>
+      <w:r>
+        <w:rPr>
+          <w:b/>
+        </w:rPr>
+        <w:t xml:space="preserve">1. การร้องขอรูปภาพ: </w:t>
+      </w:r>
+      <w:r>
+        <w:t>Frontend สั่ง GET /api/v1/images/:id พร้อมแนบ Token ของผู้ใช้</w:t>
+      </w:r>
+    </w:p>
+    <w:p>
+      <w:pPr>
+        <w:pStyle w:val="ListBullet"/>
+      </w:pPr>
+      <w:r>
+        <w:rPr>
+          <w:b/>
+        </w:rPr>
+        <w:t xml:space="preserve">2. การตรวจสอบความเป็นเจ้าของ: </w:t>
+      </w:r>
+      <w:r>
+        <w:t>Backend ค้นหาภาพในตาราง generations ด้วยเงื่อนไขคู่: id = :id AND user_id = request.user_id เสมอ</w:t>
+      </w:r>
+    </w:p>
+    <w:p>
+      <w:pPr>
+        <w:pStyle w:val="ListBullet"/>
+      </w:pPr>
+      <w:r>
+        <w:rPr>
+          <w:b/>
+        </w:rPr>
+        <w:t xml:space="preserve">3. กรณีเป็นเจ้าของภาพ: </w:t>
+      </w:r>
+      <w:r>
+        <w:t>Backend สตรีมข้อมูล Binary BLOB ในรูปแบบ Content-Type: image/png กลับไปให้ Frontend แสดงผลได้ทันที</w:t>
+      </w:r>
+    </w:p>
+    <w:p>
+      <w:pPr>
+        <w:pStyle w:val="ListBullet"/>
+      </w:pPr>
+      <w:r>
+        <w:rPr>
+          <w:b/>
+        </w:rPr>
+        <w:t xml:space="preserve">4. กรณีพยายามแอบดูภาพของผู้อื่น: </w:t>
+      </w:r>
+      <w:r>
+        <w:t>คำสั่งค้นหาจะไม่พบข้อมูล (เนื่องจาก user_id ไม่ตรงกัน) และระบบจะตอบกลับ HTTP 404 GENERATION_NOT_FOUND ทันที โดยไม่เปิดเผยข้อมูลให้ผู้ใช้คนอื่นทราบ</w:t>
+      </w:r>
+    </w:p>
+    <w:p/>
+    <w:p>
+      <w:pPr>
+        <w:pStyle w:val="Heading1"/>
+      </w:pPr>
+      <w:r>
+        <w:rPr>
+          <w:rFonts w:ascii="Cordia New" w:hAnsi="Cordia New"/>
+          <w:b/>
+          <w:color w:val="1F4E79"/>
+          <w:sz w:val="36"/>
+        </w:rPr>
+        <w:t>4. สรุปรายการ API Endpoints ทั้งหมดในระบบ</w:t>
       </w:r>
     </w:p>
     <w:tbl>
@@ -1703,14 +1339,13 @@
       <w:tr>
         <w:tc>
           <w:tcPr>
-            <w:tcW w:type="dxa" w:w="1440"/>
+            <w:tcW w:type="dxa" w:w="2340"/>
             <w:tcMar>
               <w:top w:w="80" w:type="dxa"/>
               <w:bottom w:w="80" w:type="dxa"/>
               <w:left w:w="100" w:type="dxa"/>
               <w:right w:w="100" w:type="dxa"/>
             </w:tcMar>
-            <w:shd w:fill="FFFFFF"/>
           </w:tcPr>
           <w:p>
             <w:pPr>
@@ -1728,14 +1363,13 @@
         </w:tc>
         <w:tc>
           <w:tcPr>
-            <w:tcW w:type="dxa" w:w="2880"/>
+            <w:tcW w:type="dxa" w:w="2340"/>
             <w:tcMar>
               <w:top w:w="80" w:type="dxa"/>
               <w:bottom w:w="80" w:type="dxa"/>
               <w:left w:w="100" w:type="dxa"/>
               <w:right w:w="100" w:type="dxa"/>
             </w:tcMar>
-            <w:shd w:fill="FFFFFF"/>
           </w:tcPr>
           <w:p>
             <w:pPr>
@@ -1752,14 +1386,13 @@
         </w:tc>
         <w:tc>
           <w:tcPr>
-            <w:tcW w:type="dxa" w:w="1440"/>
+            <w:tcW w:type="dxa" w:w="2340"/>
             <w:tcMar>
               <w:top w:w="80" w:type="dxa"/>
               <w:bottom w:w="80" w:type="dxa"/>
               <w:left w:w="100" w:type="dxa"/>
               <w:right w:w="100" w:type="dxa"/>
             </w:tcMar>
-            <w:shd w:fill="FFFFFF"/>
           </w:tcPr>
           <w:p>
             <w:pPr>
@@ -1776,14 +1409,13 @@
         </w:tc>
         <w:tc>
           <w:tcPr>
-            <w:tcW w:type="dxa" w:w="3600"/>
+            <w:tcW w:type="dxa" w:w="2340"/>
             <w:tcMar>
               <w:top w:w="80" w:type="dxa"/>
               <w:bottom w:w="80" w:type="dxa"/>
               <w:left w:w="100" w:type="dxa"/>
               <w:right w:w="100" w:type="dxa"/>
             </w:tcMar>
-            <w:shd w:fill="FFFFFF"/>
           </w:tcPr>
           <w:p>
             <w:pPr>
@@ -1794,7 +1426,7 @@
                 <w:rFonts w:ascii="Cordia New" w:hAnsi="Cordia New"/>
                 <w:sz w:val="26"/>
               </w:rPr>
-              <w:t>สมัครสมาชิกผู้ใช้งานใหม่ (แฮชรหัสผ่าน ป้องกันอีเมลซ้ำ)</w:t>
+              <w:t>สมัครสมาชิกผู้ใช้งานใหม่ (รับ email, password)</w:t>
             </w:r>
           </w:p>
         </w:tc>
@@ -1802,7 +1434,7 @@
       <w:tr>
         <w:tc>
           <w:tcPr>
-            <w:tcW w:type="dxa" w:w="1440"/>
+            <w:tcW w:type="dxa" w:w="2340"/>
             <w:tcMar>
               <w:top w:w="80" w:type="dxa"/>
               <w:bottom w:w="80" w:type="dxa"/>
@@ -1827,7 +1459,7 @@
         </w:tc>
         <w:tc>
           <w:tcPr>
-            <w:tcW w:type="dxa" w:w="2880"/>
+            <w:tcW w:type="dxa" w:w="2340"/>
             <w:tcMar>
               <w:top w:w="80" w:type="dxa"/>
               <w:bottom w:w="80" w:type="dxa"/>
@@ -1851,7 +1483,7 @@
         </w:tc>
         <w:tc>
           <w:tcPr>
-            <w:tcW w:type="dxa" w:w="1440"/>
+            <w:tcW w:type="dxa" w:w="2340"/>
             <w:tcMar>
               <w:top w:w="80" w:type="dxa"/>
               <w:bottom w:w="80" w:type="dxa"/>
@@ -1875,7 +1507,7 @@
         </w:tc>
         <w:tc>
           <w:tcPr>
-            <w:tcW w:type="dxa" w:w="3600"/>
+            <w:tcW w:type="dxa" w:w="2340"/>
             <w:tcMar>
               <w:top w:w="80" w:type="dxa"/>
               <w:bottom w:w="80" w:type="dxa"/>
@@ -1893,7 +1525,7 @@
                 <w:rFonts w:ascii="Cordia New" w:hAnsi="Cordia New"/>
                 <w:sz w:val="26"/>
               </w:rPr>
-              <w:t>เข้าสู่ระบบ ตรวจสอบรหัสผ่าน และรับบัตร JWT Token 24 ชม.</w:t>
+              <w:t>เข้าสู่ระบบ ตรวจสอบรหัสผ่าน และรับ JWT Token</w:t>
             </w:r>
           </w:p>
         </w:tc>
@@ -1901,14 +1533,13 @@
       <w:tr>
         <w:tc>
           <w:tcPr>
-            <w:tcW w:type="dxa" w:w="1440"/>
+            <w:tcW w:type="dxa" w:w="2340"/>
             <w:tcMar>
               <w:top w:w="80" w:type="dxa"/>
               <w:bottom w:w="80" w:type="dxa"/>
               <w:left w:w="100" w:type="dxa"/>
               <w:right w:w="100" w:type="dxa"/>
             </w:tcMar>
-            <w:shd w:fill="FFFFFF"/>
           </w:tcPr>
           <w:p>
             <w:pPr>
@@ -1926,14 +1557,13 @@
         </w:tc>
         <w:tc>
           <w:tcPr>
-            <w:tcW w:type="dxa" w:w="2880"/>
+            <w:tcW w:type="dxa" w:w="2340"/>
             <w:tcMar>
               <w:top w:w="80" w:type="dxa"/>
               <w:bottom w:w="80" w:type="dxa"/>
               <w:left w:w="100" w:type="dxa"/>
               <w:right w:w="100" w:type="dxa"/>
             </w:tcMar>
-            <w:shd w:fill="FFFFFF"/>
           </w:tcPr>
           <w:p>
             <w:pPr>
@@ -1944,20 +1574,213 @@
                 <w:rFonts w:ascii="Cordia New" w:hAnsi="Cordia New"/>
                 <w:sz w:val="26"/>
               </w:rPr>
-              <w:t>/api/v1/profile</w:t>
+              <w:t>/api/v1/models</w:t>
             </w:r>
           </w:p>
         </w:tc>
         <w:tc>
           <w:tcPr>
-            <w:tcW w:type="dxa" w:w="1440"/>
+            <w:tcW w:type="dxa" w:w="2340"/>
             <w:tcMar>
               <w:top w:w="80" w:type="dxa"/>
               <w:bottom w:w="80" w:type="dxa"/>
               <w:left w:w="100" w:type="dxa"/>
               <w:right w:w="100" w:type="dxa"/>
             </w:tcMar>
-            <w:shd w:fill="FFFFFF"/>
+          </w:tcPr>
+          <w:p>
+            <w:pPr>
+              <w:spacing w:line="276" w:lineRule="auto"/>
+            </w:pPr>
+            <w:r>
+              <w:rPr>
+                <w:rFonts w:ascii="Cordia New" w:hAnsi="Cordia New"/>
+                <w:sz w:val="26"/>
+              </w:rPr>
+              <w:t>ไม่จำเป็น</w:t>
+            </w:r>
+          </w:p>
+        </w:tc>
+        <w:tc>
+          <w:tcPr>
+            <w:tcW w:type="dxa" w:w="2340"/>
+            <w:tcMar>
+              <w:top w:w="80" w:type="dxa"/>
+              <w:bottom w:w="80" w:type="dxa"/>
+              <w:left w:w="100" w:type="dxa"/>
+              <w:right w:w="100" w:type="dxa"/>
+            </w:tcMar>
+          </w:tcPr>
+          <w:p>
+            <w:pPr>
+              <w:spacing w:line="276" w:lineRule="auto"/>
+            </w:pPr>
+            <w:r>
+              <w:rPr>
+                <w:rFonts w:ascii="Cordia New" w:hAnsi="Cordia New"/>
+                <w:sz w:val="26"/>
+              </w:rPr>
+              <w:t>ดึงรายชื่อ Checkpoint Models ทั้งหมดจาก AI Server</w:t>
+            </w:r>
+          </w:p>
+        </w:tc>
+      </w:tr>
+      <w:tr>
+        <w:tc>
+          <w:tcPr>
+            <w:tcW w:type="dxa" w:w="2340"/>
+            <w:tcMar>
+              <w:top w:w="80" w:type="dxa"/>
+              <w:bottom w:w="80" w:type="dxa"/>
+              <w:left w:w="100" w:type="dxa"/>
+              <w:right w:w="100" w:type="dxa"/>
+            </w:tcMar>
+            <w:shd w:fill="FAFAFA"/>
+          </w:tcPr>
+          <w:p>
+            <w:pPr>
+              <w:spacing w:line="276" w:lineRule="auto"/>
+            </w:pPr>
+            <w:r>
+              <w:rPr>
+                <w:rFonts w:ascii="Cordia New" w:hAnsi="Cordia New"/>
+                <w:b/>
+                <w:sz w:val="26"/>
+              </w:rPr>
+              <w:t>POST</w:t>
+            </w:r>
+          </w:p>
+        </w:tc>
+        <w:tc>
+          <w:tcPr>
+            <w:tcW w:type="dxa" w:w="2340"/>
+            <w:tcMar>
+              <w:top w:w="80" w:type="dxa"/>
+              <w:bottom w:w="80" w:type="dxa"/>
+              <w:left w:w="100" w:type="dxa"/>
+              <w:right w:w="100" w:type="dxa"/>
+            </w:tcMar>
+            <w:shd w:fill="FAFAFA"/>
+          </w:tcPr>
+          <w:p>
+            <w:pPr>
+              <w:spacing w:line="276" w:lineRule="auto"/>
+            </w:pPr>
+            <w:r>
+              <w:rPr>
+                <w:rFonts w:ascii="Cordia New" w:hAnsi="Cordia New"/>
+                <w:sz w:val="26"/>
+              </w:rPr>
+              <w:t>/api/v1/estimate</w:t>
+            </w:r>
+          </w:p>
+        </w:tc>
+        <w:tc>
+          <w:tcPr>
+            <w:tcW w:type="dxa" w:w="2340"/>
+            <w:tcMar>
+              <w:top w:w="80" w:type="dxa"/>
+              <w:bottom w:w="80" w:type="dxa"/>
+              <w:left w:w="100" w:type="dxa"/>
+              <w:right w:w="100" w:type="dxa"/>
+            </w:tcMar>
+            <w:shd w:fill="FAFAFA"/>
+          </w:tcPr>
+          <w:p>
+            <w:pPr>
+              <w:spacing w:line="276" w:lineRule="auto"/>
+            </w:pPr>
+            <w:r>
+              <w:rPr>
+                <w:rFonts w:ascii="Cordia New" w:hAnsi="Cordia New"/>
+                <w:sz w:val="26"/>
+              </w:rPr>
+              <w:t>ไม่จำเป็น</w:t>
+            </w:r>
+          </w:p>
+        </w:tc>
+        <w:tc>
+          <w:tcPr>
+            <w:tcW w:type="dxa" w:w="2340"/>
+            <w:tcMar>
+              <w:top w:w="80" w:type="dxa"/>
+              <w:bottom w:w="80" w:type="dxa"/>
+              <w:left w:w="100" w:type="dxa"/>
+              <w:right w:w="100" w:type="dxa"/>
+            </w:tcMar>
+            <w:shd w:fill="FAFAFA"/>
+          </w:tcPr>
+          <w:p>
+            <w:pPr>
+              <w:spacing w:line="276" w:lineRule="auto"/>
+            </w:pPr>
+            <w:r>
+              <w:rPr>
+                <w:rFonts w:ascii="Cordia New" w:hAnsi="Cordia New"/>
+                <w:sz w:val="26"/>
+              </w:rPr>
+              <w:t>คำนวณเวลาประเมินล่วงหน้าในการสร้างภาพ</w:t>
+            </w:r>
+          </w:p>
+        </w:tc>
+      </w:tr>
+      <w:tr>
+        <w:tc>
+          <w:tcPr>
+            <w:tcW w:type="dxa" w:w="2340"/>
+            <w:tcMar>
+              <w:top w:w="80" w:type="dxa"/>
+              <w:bottom w:w="80" w:type="dxa"/>
+              <w:left w:w="100" w:type="dxa"/>
+              <w:right w:w="100" w:type="dxa"/>
+            </w:tcMar>
+          </w:tcPr>
+          <w:p>
+            <w:pPr>
+              <w:spacing w:line="276" w:lineRule="auto"/>
+            </w:pPr>
+            <w:r>
+              <w:rPr>
+                <w:rFonts w:ascii="Cordia New" w:hAnsi="Cordia New"/>
+                <w:b/>
+                <w:sz w:val="26"/>
+              </w:rPr>
+              <w:t>POST</w:t>
+            </w:r>
+          </w:p>
+        </w:tc>
+        <w:tc>
+          <w:tcPr>
+            <w:tcW w:type="dxa" w:w="2340"/>
+            <w:tcMar>
+              <w:top w:w="80" w:type="dxa"/>
+              <w:bottom w:w="80" w:type="dxa"/>
+              <w:left w:w="100" w:type="dxa"/>
+              <w:right w:w="100" w:type="dxa"/>
+            </w:tcMar>
+          </w:tcPr>
+          <w:p>
+            <w:pPr>
+              <w:spacing w:line="276" w:lineRule="auto"/>
+            </w:pPr>
+            <w:r>
+              <w:rPr>
+                <w:rFonts w:ascii="Cordia New" w:hAnsi="Cordia New"/>
+                <w:sz w:val="26"/>
+              </w:rPr>
+              <w:t>/api/v1/generate</w:t>
+            </w:r>
+          </w:p>
+        </w:tc>
+        <w:tc>
+          <w:tcPr>
+            <w:tcW w:type="dxa" w:w="2340"/>
+            <w:tcMar>
+              <w:top w:w="80" w:type="dxa"/>
+              <w:bottom w:w="80" w:type="dxa"/>
+              <w:left w:w="100" w:type="dxa"/>
+              <w:right w:w="100" w:type="dxa"/>
+            </w:tcMar>
           </w:tcPr>
           <w:p>
             <w:pPr>
@@ -1974,14 +1797,13 @@
         </w:tc>
         <w:tc>
           <w:tcPr>
-            <w:tcW w:type="dxa" w:w="3600"/>
+            <w:tcW w:type="dxa" w:w="2340"/>
             <w:tcMar>
               <w:top w:w="80" w:type="dxa"/>
               <w:bottom w:w="80" w:type="dxa"/>
               <w:left w:w="100" w:type="dxa"/>
               <w:right w:w="100" w:type="dxa"/>
             </w:tcMar>
-            <w:shd w:fill="FFFFFF"/>
           </w:tcPr>
           <w:p>
             <w:pPr>
@@ -1992,7 +1814,7 @@
                 <w:rFonts w:ascii="Cordia New" w:hAnsi="Cordia New"/>
                 <w:sz w:val="26"/>
               </w:rPr>
-              <w:t>ดึงข้อมูลโปรไฟล์และสรุปสถิติจำนวนภาพที่สร้างทั้งหมด</w:t>
+              <w:t>สั่งสร้างรูปภาพ AI (ผูกข้อมูลกับเจ้าของบัญชี)</w:t>
             </w:r>
           </w:p>
         </w:tc>
@@ -2000,7 +1822,7 @@
       <w:tr>
         <w:tc>
           <w:tcPr>
-            <w:tcW w:type="dxa" w:w="1440"/>
+            <w:tcW w:type="dxa" w:w="2340"/>
             <w:tcMar>
               <w:top w:w="80" w:type="dxa"/>
               <w:bottom w:w="80" w:type="dxa"/>
@@ -2025,7 +1847,7 @@
         </w:tc>
         <w:tc>
           <w:tcPr>
-            <w:tcW w:type="dxa" w:w="2880"/>
+            <w:tcW w:type="dxa" w:w="2340"/>
             <w:tcMar>
               <w:top w:w="80" w:type="dxa"/>
               <w:bottom w:w="80" w:type="dxa"/>
@@ -2043,211 +1865,13 @@
                 <w:rFonts w:ascii="Cordia New" w:hAnsi="Cordia New"/>
                 <w:sz w:val="26"/>
               </w:rPr>
-              <w:t>/api/v1/models</w:t>
+              <w:t>/api/v1/images/:id</w:t>
             </w:r>
           </w:p>
         </w:tc>
         <w:tc>
           <w:tcPr>
-            <w:tcW w:type="dxa" w:w="1440"/>
-            <w:tcMar>
-              <w:top w:w="80" w:type="dxa"/>
-              <w:bottom w:w="80" w:type="dxa"/>
-              <w:left w:w="100" w:type="dxa"/>
-              <w:right w:w="100" w:type="dxa"/>
-            </w:tcMar>
-            <w:shd w:fill="FAFAFA"/>
-          </w:tcPr>
-          <w:p>
-            <w:pPr>
-              <w:spacing w:line="276" w:lineRule="auto"/>
-            </w:pPr>
-            <w:r>
-              <w:rPr>
-                <w:rFonts w:ascii="Cordia New" w:hAnsi="Cordia New"/>
-                <w:sz w:val="26"/>
-              </w:rPr>
-              <w:t>ไม่จำเป็น</w:t>
-            </w:r>
-          </w:p>
-        </w:tc>
-        <w:tc>
-          <w:tcPr>
-            <w:tcW w:type="dxa" w:w="3600"/>
-            <w:tcMar>
-              <w:top w:w="80" w:type="dxa"/>
-              <w:bottom w:w="80" w:type="dxa"/>
-              <w:left w:w="100" w:type="dxa"/>
-              <w:right w:w="100" w:type="dxa"/>
-            </w:tcMar>
-            <w:shd w:fill="FAFAFA"/>
-          </w:tcPr>
-          <w:p>
-            <w:pPr>
-              <w:spacing w:line="276" w:lineRule="auto"/>
-            </w:pPr>
-            <w:r>
-              <w:rPr>
-                <w:rFonts w:ascii="Cordia New" w:hAnsi="Cordia New"/>
-                <w:sz w:val="26"/>
-              </w:rPr>
-              <w:t>ดึงรายชื่อ Checkpoint Models ทั้งหมดจาก AI Server</w:t>
-            </w:r>
-          </w:p>
-        </w:tc>
-      </w:tr>
-      <w:tr>
-        <w:tc>
-          <w:tcPr>
-            <w:tcW w:type="dxa" w:w="1440"/>
-            <w:tcMar>
-              <w:top w:w="80" w:type="dxa"/>
-              <w:bottom w:w="80" w:type="dxa"/>
-              <w:left w:w="100" w:type="dxa"/>
-              <w:right w:w="100" w:type="dxa"/>
-            </w:tcMar>
-            <w:shd w:fill="FFFFFF"/>
-          </w:tcPr>
-          <w:p>
-            <w:pPr>
-              <w:spacing w:line="276" w:lineRule="auto"/>
-            </w:pPr>
-            <w:r>
-              <w:rPr>
-                <w:rFonts w:ascii="Cordia New" w:hAnsi="Cordia New"/>
-                <w:b/>
-                <w:sz w:val="26"/>
-              </w:rPr>
-              <w:t>POST</w:t>
-            </w:r>
-          </w:p>
-        </w:tc>
-        <w:tc>
-          <w:tcPr>
-            <w:tcW w:type="dxa" w:w="2880"/>
-            <w:tcMar>
-              <w:top w:w="80" w:type="dxa"/>
-              <w:bottom w:w="80" w:type="dxa"/>
-              <w:left w:w="100" w:type="dxa"/>
-              <w:right w:w="100" w:type="dxa"/>
-            </w:tcMar>
-            <w:shd w:fill="FFFFFF"/>
-          </w:tcPr>
-          <w:p>
-            <w:pPr>
-              <w:spacing w:line="276" w:lineRule="auto"/>
-            </w:pPr>
-            <w:r>
-              <w:rPr>
-                <w:rFonts w:ascii="Cordia New" w:hAnsi="Cordia New"/>
-                <w:sz w:val="26"/>
-              </w:rPr>
-              <w:t>/api/v1/estimate</w:t>
-            </w:r>
-          </w:p>
-        </w:tc>
-        <w:tc>
-          <w:tcPr>
-            <w:tcW w:type="dxa" w:w="1440"/>
-            <w:tcMar>
-              <w:top w:w="80" w:type="dxa"/>
-              <w:bottom w:w="80" w:type="dxa"/>
-              <w:left w:w="100" w:type="dxa"/>
-              <w:right w:w="100" w:type="dxa"/>
-            </w:tcMar>
-            <w:shd w:fill="FFFFFF"/>
-          </w:tcPr>
-          <w:p>
-            <w:pPr>
-              <w:spacing w:line="276" w:lineRule="auto"/>
-            </w:pPr>
-            <w:r>
-              <w:rPr>
-                <w:rFonts w:ascii="Cordia New" w:hAnsi="Cordia New"/>
-                <w:sz w:val="26"/>
-              </w:rPr>
-              <w:t>ไม่จำเป็น</w:t>
-            </w:r>
-          </w:p>
-        </w:tc>
-        <w:tc>
-          <w:tcPr>
-            <w:tcW w:type="dxa" w:w="3600"/>
-            <w:tcMar>
-              <w:top w:w="80" w:type="dxa"/>
-              <w:bottom w:w="80" w:type="dxa"/>
-              <w:left w:w="100" w:type="dxa"/>
-              <w:right w:w="100" w:type="dxa"/>
-            </w:tcMar>
-            <w:shd w:fill="FFFFFF"/>
-          </w:tcPr>
-          <w:p>
-            <w:pPr>
-              <w:spacing w:line="276" w:lineRule="auto"/>
-            </w:pPr>
-            <w:r>
-              <w:rPr>
-                <w:rFonts w:ascii="Cordia New" w:hAnsi="Cordia New"/>
-                <w:sz w:val="26"/>
-              </w:rPr>
-              <w:t>คำนวณเวลาประเมินล่วงหน้าในการสร้างภาพตาม Steps และคิวรอ</w:t>
-            </w:r>
-          </w:p>
-        </w:tc>
-      </w:tr>
-      <w:tr>
-        <w:tc>
-          <w:tcPr>
-            <w:tcW w:type="dxa" w:w="1440"/>
-            <w:tcMar>
-              <w:top w:w="80" w:type="dxa"/>
-              <w:bottom w:w="80" w:type="dxa"/>
-              <w:left w:w="100" w:type="dxa"/>
-              <w:right w:w="100" w:type="dxa"/>
-            </w:tcMar>
-            <w:shd w:fill="FAFAFA"/>
-          </w:tcPr>
-          <w:p>
-            <w:pPr>
-              <w:spacing w:line="276" w:lineRule="auto"/>
-            </w:pPr>
-            <w:r>
-              <w:rPr>
-                <w:rFonts w:ascii="Cordia New" w:hAnsi="Cordia New"/>
-                <w:b/>
-                <w:sz w:val="26"/>
-              </w:rPr>
-              <w:t>POST</w:t>
-            </w:r>
-          </w:p>
-        </w:tc>
-        <w:tc>
-          <w:tcPr>
-            <w:tcW w:type="dxa" w:w="2880"/>
-            <w:tcMar>
-              <w:top w:w="80" w:type="dxa"/>
-              <w:bottom w:w="80" w:type="dxa"/>
-              <w:left w:w="100" w:type="dxa"/>
-              <w:right w:w="100" w:type="dxa"/>
-            </w:tcMar>
-            <w:shd w:fill="FAFAFA"/>
-          </w:tcPr>
-          <w:p>
-            <w:pPr>
-              <w:spacing w:line="276" w:lineRule="auto"/>
-            </w:pPr>
-            <w:r>
-              <w:rPr>
-                <w:rFonts w:ascii="Cordia New" w:hAnsi="Cordia New"/>
-                <w:sz w:val="26"/>
-              </w:rPr>
-              <w:t>/api/v1/generate</w:t>
-            </w:r>
-          </w:p>
-        </w:tc>
-        <w:tc>
-          <w:tcPr>
-            <w:tcW w:type="dxa" w:w="1440"/>
+            <w:tcW w:type="dxa" w:w="2340"/>
             <w:tcMar>
               <w:top w:w="80" w:type="dxa"/>
               <w:bottom w:w="80" w:type="dxa"/>
@@ -2271,7 +1895,7 @@
         </w:tc>
         <w:tc>
           <w:tcPr>
-            <w:tcW w:type="dxa" w:w="3600"/>
+            <w:tcW w:type="dxa" w:w="2340"/>
             <w:tcMar>
               <w:top w:w="80" w:type="dxa"/>
               <w:bottom w:w="80" w:type="dxa"/>
@@ -2289,7 +1913,7 @@
                 <w:rFonts w:ascii="Cordia New" w:hAnsi="Cordia New"/>
                 <w:sz w:val="26"/>
               </w:rPr>
-              <w:t>สั่งสร้างรูปภาพ AI (เข้าคิว GPU Lock และผูกกับเจ้าของบัญชี)</w:t>
+              <w:t>สตรีมไฟล์รูปภาพ Binary PNG (จำกัดสิทธิ์เฉพาะเจ้าของ)</w:t>
             </w:r>
           </w:p>
         </w:tc>
@@ -2297,14 +1921,13 @@
       <w:tr>
         <w:tc>
           <w:tcPr>
-            <w:tcW w:type="dxa" w:w="1440"/>
+            <w:tcW w:type="dxa" w:w="2340"/>
             <w:tcMar>
               <w:top w:w="80" w:type="dxa"/>
               <w:bottom w:w="80" w:type="dxa"/>
               <w:left w:w="100" w:type="dxa"/>
               <w:right w:w="100" w:type="dxa"/>
             </w:tcMar>
-            <w:shd w:fill="FFFFFF"/>
           </w:tcPr>
           <w:p>
             <w:pPr>
@@ -2322,14 +1945,13 @@
         </w:tc>
         <w:tc>
           <w:tcPr>
-            <w:tcW w:type="dxa" w:w="2880"/>
+            <w:tcW w:type="dxa" w:w="2340"/>
             <w:tcMar>
               <w:top w:w="80" w:type="dxa"/>
               <w:bottom w:w="80" w:type="dxa"/>
               <w:left w:w="100" w:type="dxa"/>
               <w:right w:w="100" w:type="dxa"/>
             </w:tcMar>
-            <w:shd w:fill="FFFFFF"/>
           </w:tcPr>
           <w:p>
             <w:pPr>
@@ -2340,20 +1962,19 @@
                 <w:rFonts w:ascii="Cordia New" w:hAnsi="Cordia New"/>
                 <w:sz w:val="26"/>
               </w:rPr>
-              <w:t>/api/v1/images/:id</w:t>
+              <w:t>/api/v1/history</w:t>
             </w:r>
           </w:p>
         </w:tc>
         <w:tc>
           <w:tcPr>
-            <w:tcW w:type="dxa" w:w="1440"/>
+            <w:tcW w:type="dxa" w:w="2340"/>
             <w:tcMar>
               <w:top w:w="80" w:type="dxa"/>
               <w:bottom w:w="80" w:type="dxa"/>
               <w:left w:w="100" w:type="dxa"/>
               <w:right w:w="100" w:type="dxa"/>
             </w:tcMar>
-            <w:shd w:fill="FFFFFF"/>
           </w:tcPr>
           <w:p>
             <w:pPr>
@@ -2370,14 +1991,13 @@
         </w:tc>
         <w:tc>
           <w:tcPr>
-            <w:tcW w:type="dxa" w:w="3600"/>
+            <w:tcW w:type="dxa" w:w="2340"/>
             <w:tcMar>
               <w:top w:w="80" w:type="dxa"/>
               <w:bottom w:w="80" w:type="dxa"/>
               <w:left w:w="100" w:type="dxa"/>
               <w:right w:w="100" w:type="dxa"/>
             </w:tcMar>
-            <w:shd w:fill="FFFFFF"/>
           </w:tcPr>
           <w:p>
             <w:pPr>
@@ -2388,7 +2008,7 @@
                 <w:rFonts w:ascii="Cordia New" w:hAnsi="Cordia New"/>
                 <w:sz w:val="26"/>
               </w:rPr>
-              <w:t>สตรีมไฟล์รูปภาพ Binary PNG (จำกัดสิทธิ์เฉพาะเจ้าของ ป้องกัน IDOR)</w:t>
+              <w:t>ดึงรายการประวัติภาพพร้อม Pagination และ Filter</w:t>
             </w:r>
           </w:p>
         </w:tc>
@@ -2396,7 +2016,7 @@
       <w:tr>
         <w:tc>
           <w:tcPr>
-            <w:tcW w:type="dxa" w:w="1440"/>
+            <w:tcW w:type="dxa" w:w="2340"/>
             <w:tcMar>
               <w:top w:w="80" w:type="dxa"/>
               <w:bottom w:w="80" w:type="dxa"/>
@@ -2421,7 +2041,7 @@
         </w:tc>
         <w:tc>
           <w:tcPr>
-            <w:tcW w:type="dxa" w:w="2880"/>
+            <w:tcW w:type="dxa" w:w="2340"/>
             <w:tcMar>
               <w:top w:w="80" w:type="dxa"/>
               <w:bottom w:w="80" w:type="dxa"/>
@@ -2439,13 +2059,13 @@
                 <w:rFonts w:ascii="Cordia New" w:hAnsi="Cordia New"/>
                 <w:sz w:val="26"/>
               </w:rPr>
-              <w:t>/api/v1/history</w:t>
+              <w:t>/api/v1/history/:id</w:t>
             </w:r>
           </w:p>
         </w:tc>
         <w:tc>
           <w:tcPr>
-            <w:tcW w:type="dxa" w:w="1440"/>
+            <w:tcW w:type="dxa" w:w="2340"/>
             <w:tcMar>
               <w:top w:w="80" w:type="dxa"/>
               <w:bottom w:w="80" w:type="dxa"/>
@@ -2469,7 +2089,7 @@
         </w:tc>
         <w:tc>
           <w:tcPr>
-            <w:tcW w:type="dxa" w:w="3600"/>
+            <w:tcW w:type="dxa" w:w="2340"/>
             <w:tcMar>
               <w:top w:w="80" w:type="dxa"/>
               <w:bottom w:w="80" w:type="dxa"/>
@@ -2487,7 +2107,7 @@
                 <w:rFonts w:ascii="Cordia New" w:hAnsi="Cordia New"/>
                 <w:sz w:val="26"/>
               </w:rPr>
-              <w:t>ดึงรายการประวัติภาพพร้อม Pagination และ Filter</w:t>
+              <w:t>ดึงรายละเอียดพารามิเตอร์เต็มของภาพรายการนั้น</w:t>
             </w:r>
           </w:p>
         </w:tc>
@@ -2495,14 +2115,13 @@
       <w:tr>
         <w:tc>
           <w:tcPr>
-            <w:tcW w:type="dxa" w:w="1440"/>
+            <w:tcW w:type="dxa" w:w="2340"/>
             <w:tcMar>
               <w:top w:w="80" w:type="dxa"/>
               <w:bottom w:w="80" w:type="dxa"/>
               <w:left w:w="100" w:type="dxa"/>
               <w:right w:w="100" w:type="dxa"/>
             </w:tcMar>
-            <w:shd w:fill="FFFFFF"/>
           </w:tcPr>
           <w:p>
             <w:pPr>
@@ -2514,20 +2133,19 @@
                 <w:b/>
                 <w:sz w:val="26"/>
               </w:rPr>
-              <w:t>GET</w:t>
+              <w:t>DELETE</w:t>
             </w:r>
           </w:p>
         </w:tc>
         <w:tc>
           <w:tcPr>
-            <w:tcW w:type="dxa" w:w="2880"/>
+            <w:tcW w:type="dxa" w:w="2340"/>
             <w:tcMar>
               <w:top w:w="80" w:type="dxa"/>
               <w:bottom w:w="80" w:type="dxa"/>
               <w:left w:w="100" w:type="dxa"/>
               <w:right w:w="100" w:type="dxa"/>
             </w:tcMar>
-            <w:shd w:fill="FFFFFF"/>
           </w:tcPr>
           <w:p>
             <w:pPr>
@@ -2544,14 +2162,13 @@
         </w:tc>
         <w:tc>
           <w:tcPr>
-            <w:tcW w:type="dxa" w:w="1440"/>
+            <w:tcW w:type="dxa" w:w="2340"/>
             <w:tcMar>
               <w:top w:w="80" w:type="dxa"/>
               <w:bottom w:w="80" w:type="dxa"/>
               <w:left w:w="100" w:type="dxa"/>
               <w:right w:w="100" w:type="dxa"/>
             </w:tcMar>
-            <w:shd w:fill="FFFFFF"/>
           </w:tcPr>
           <w:p>
             <w:pPr>
@@ -2568,14 +2185,13 @@
         </w:tc>
         <w:tc>
           <w:tcPr>
-            <w:tcW w:type="dxa" w:w="3600"/>
+            <w:tcW w:type="dxa" w:w="2340"/>
             <w:tcMar>
               <w:top w:w="80" w:type="dxa"/>
               <w:bottom w:w="80" w:type="dxa"/>
               <w:left w:w="100" w:type="dxa"/>
               <w:right w:w="100" w:type="dxa"/>
             </w:tcMar>
-            <w:shd w:fill="FFFFFF"/>
           </w:tcPr>
           <w:p>
             <w:pPr>
@@ -2586,7 +2202,7 @@
                 <w:rFonts w:ascii="Cordia New" w:hAnsi="Cordia New"/>
                 <w:sz w:val="26"/>
               </w:rPr>
-              <w:t>ดึงรายละเอียดพารามิเตอร์เต็มของภาพ</w:t>
+              <w:t>ลบประวัติรูปภาพของตนเองออกจากระบบ</w:t>
             </w:r>
           </w:p>
         </w:tc>
@@ -2594,7 +2210,7 @@
       <w:tr>
         <w:tc>
           <w:tcPr>
-            <w:tcW w:type="dxa" w:w="1440"/>
+            <w:tcW w:type="dxa" w:w="2340"/>
             <w:tcMar>
               <w:top w:w="80" w:type="dxa"/>
               <w:bottom w:w="80" w:type="dxa"/>
@@ -2613,13 +2229,13 @@
                 <w:b/>
                 <w:sz w:val="26"/>
               </w:rPr>
-              <w:t>DELETE</w:t>
+              <w:t>GET</w:t>
             </w:r>
           </w:p>
         </w:tc>
         <w:tc>
           <w:tcPr>
-            <w:tcW w:type="dxa" w:w="2880"/>
+            <w:tcW w:type="dxa" w:w="2340"/>
             <w:tcMar>
               <w:top w:w="80" w:type="dxa"/>
               <w:bottom w:w="80" w:type="dxa"/>
@@ -2637,13 +2253,13 @@
                 <w:rFonts w:ascii="Cordia New" w:hAnsi="Cordia New"/>
                 <w:sz w:val="26"/>
               </w:rPr>
-              <w:t>/api/v1/history/:id</w:t>
+              <w:t>/api/v1/profile</w:t>
             </w:r>
           </w:p>
         </w:tc>
         <w:tc>
           <w:tcPr>
-            <w:tcW w:type="dxa" w:w="1440"/>
+            <w:tcW w:type="dxa" w:w="2340"/>
             <w:tcMar>
               <w:top w:w="80" w:type="dxa"/>
               <w:bottom w:w="80" w:type="dxa"/>
@@ -2667,7 +2283,7 @@
         </w:tc>
         <w:tc>
           <w:tcPr>
-            <w:tcW w:type="dxa" w:w="3600"/>
+            <w:tcW w:type="dxa" w:w="2340"/>
             <w:tcMar>
               <w:top w:w="80" w:type="dxa"/>
               <w:bottom w:w="80" w:type="dxa"/>
@@ -2685,106 +2301,7 @@
                 <w:rFonts w:ascii="Cordia New" w:hAnsi="Cordia New"/>
                 <w:sz w:val="26"/>
               </w:rPr>
-              <w:t>ลบประวัติรูปภาพของตนเองออกจากระบบ</w:t>
-            </w:r>
-          </w:p>
-        </w:tc>
-      </w:tr>
-      <w:tr>
-        <w:tc>
-          <w:tcPr>
-            <w:tcW w:type="dxa" w:w="1440"/>
-            <w:tcMar>
-              <w:top w:w="80" w:type="dxa"/>
-              <w:bottom w:w="80" w:type="dxa"/>
-              <w:left w:w="100" w:type="dxa"/>
-              <w:right w:w="100" w:type="dxa"/>
-            </w:tcMar>
-            <w:shd w:fill="FFFFFF"/>
-          </w:tcPr>
-          <w:p>
-            <w:pPr>
-              <w:spacing w:line="276" w:lineRule="auto"/>
-            </w:pPr>
-            <w:r>
-              <w:rPr>
-                <w:rFonts w:ascii="Cordia New" w:hAnsi="Cordia New"/>
-                <w:b/>
-                <w:sz w:val="26"/>
-              </w:rPr>
-              <w:t>POST</w:t>
-            </w:r>
-          </w:p>
-        </w:tc>
-        <w:tc>
-          <w:tcPr>
-            <w:tcW w:type="dxa" w:w="2880"/>
-            <w:tcMar>
-              <w:top w:w="80" w:type="dxa"/>
-              <w:bottom w:w="80" w:type="dxa"/>
-              <w:left w:w="100" w:type="dxa"/>
-              <w:right w:w="100" w:type="dxa"/>
-            </w:tcMar>
-            <w:shd w:fill="FFFFFF"/>
-          </w:tcPr>
-          <w:p>
-            <w:pPr>
-              <w:spacing w:line="276" w:lineRule="auto"/>
-            </w:pPr>
-            <w:r>
-              <w:rPr>
-                <w:rFonts w:ascii="Cordia New" w:hAnsi="Cordia New"/>
-                <w:sz w:val="26"/>
-              </w:rPr>
-              <w:t>/api/v1/process/*</w:t>
-            </w:r>
-          </w:p>
-        </w:tc>
-        <w:tc>
-          <w:tcPr>
-            <w:tcW w:type="dxa" w:w="1440"/>
-            <w:tcMar>
-              <w:top w:w="80" w:type="dxa"/>
-              <w:bottom w:w="80" w:type="dxa"/>
-              <w:left w:w="100" w:type="dxa"/>
-              <w:right w:w="100" w:type="dxa"/>
-            </w:tcMar>
-            <w:shd w:fill="FFFFFF"/>
-          </w:tcPr>
-          <w:p>
-            <w:pPr>
-              <w:spacing w:line="276" w:lineRule="auto"/>
-            </w:pPr>
-            <w:r>
-              <w:rPr>
-                <w:rFonts w:ascii="Cordia New" w:hAnsi="Cordia New"/>
-                <w:sz w:val="26"/>
-              </w:rPr>
-              <w:t>ต้องมี</w:t>
-            </w:r>
-          </w:p>
-        </w:tc>
-        <w:tc>
-          <w:tcPr>
-            <w:tcW w:type="dxa" w:w="3600"/>
-            <w:tcMar>
-              <w:top w:w="80" w:type="dxa"/>
-              <w:bottom w:w="80" w:type="dxa"/>
-              <w:left w:w="100" w:type="dxa"/>
-              <w:right w:w="100" w:type="dxa"/>
-            </w:tcMar>
-            <w:shd w:fill="FFFFFF"/>
-          </w:tcPr>
-          <w:p>
-            <w:pPr>
-              <w:spacing w:line="276" w:lineRule="auto"/>
-            </w:pPr>
-            <w:r>
-              <w:rPr>
-                <w:rFonts w:ascii="Cordia New" w:hAnsi="Cordia New"/>
-                <w:sz w:val="26"/>
-              </w:rPr>
-              <w:t>กลุ่มเส้นทาง Image Processing (ดูใน IMAGE_PROCESSING_REPORT)</w:t>
+              <w:t>ดึงข้อมูลโปรไฟล์และสรุปสถิติจำนวนภาพที่สร้างทั้งหมด</w:t>
             </w:r>
           </w:p>
         </w:tc>
@@ -2802,7 +2319,7 @@
           <w:color w:val="1F4E79"/>
           <w:sz w:val="36"/>
         </w:rPr>
-        <w:t>4. มาตรฐานรหัสข้อผิดพลาด (Standard Error Codes)</w:t>
+        <w:t>5. มาตรฐานรหัสข้อผิดพลาด (Standard Error Codes)</w:t>
       </w:r>
     </w:p>
     <w:tbl>
@@ -2820,7 +2337,7 @@
       <w:tr>
         <w:tc>
           <w:tcPr>
-            <w:tcW w:type="dxa" w:w="3168"/>
+            <w:tcW w:type="dxa" w:w="3120"/>
             <w:tcMar>
               <w:top w:w="80" w:type="dxa"/>
               <w:bottom w:w="80" w:type="dxa"/>
@@ -2846,7 +2363,7 @@
         </w:tc>
         <w:tc>
           <w:tcPr>
-            <w:tcW w:type="dxa" w:w="1584"/>
+            <w:tcW w:type="dxa" w:w="3120"/>
             <w:tcMar>
               <w:top w:w="80" w:type="dxa"/>
               <w:bottom w:w="80" w:type="dxa"/>
@@ -2872,7 +2389,7 @@
         </w:tc>
         <w:tc>
           <w:tcPr>
-            <w:tcW w:type="dxa" w:w="4608"/>
+            <w:tcW w:type="dxa" w:w="3120"/>
             <w:tcMar>
               <w:top w:w="80" w:type="dxa"/>
               <w:bottom w:w="80" w:type="dxa"/>
@@ -2900,14 +2417,13 @@
       <w:tr>
         <w:tc>
           <w:tcPr>
-            <w:tcW w:type="dxa" w:w="3168"/>
+            <w:tcW w:type="dxa" w:w="3120"/>
             <w:tcMar>
               <w:top w:w="80" w:type="dxa"/>
               <w:bottom w:w="80" w:type="dxa"/>
               <w:left w:w="100" w:type="dxa"/>
               <w:right w:w="100" w:type="dxa"/>
             </w:tcMar>
-            <w:shd w:fill="FFFFFF"/>
           </w:tcPr>
           <w:p>
             <w:pPr>
@@ -2925,14 +2441,13 @@
         </w:tc>
         <w:tc>
           <w:tcPr>
-            <w:tcW w:type="dxa" w:w="1584"/>
+            <w:tcW w:type="dxa" w:w="3120"/>
             <w:tcMar>
               <w:top w:w="80" w:type="dxa"/>
               <w:bottom w:w="80" w:type="dxa"/>
               <w:left w:w="100" w:type="dxa"/>
               <w:right w:w="100" w:type="dxa"/>
             </w:tcMar>
-            <w:shd w:fill="FFFFFF"/>
           </w:tcPr>
           <w:p>
             <w:pPr>
@@ -2949,14 +2464,13 @@
         </w:tc>
         <w:tc>
           <w:tcPr>
-            <w:tcW w:type="dxa" w:w="4608"/>
+            <w:tcW w:type="dxa" w:w="3120"/>
             <w:tcMar>
               <w:top w:w="80" w:type="dxa"/>
               <w:bottom w:w="80" w:type="dxa"/>
               <w:left w:w="100" w:type="dxa"/>
               <w:right w:w="100" w:type="dxa"/>
             </w:tcMar>
-            <w:shd w:fill="FFFFFF"/>
           </w:tcPr>
           <w:p>
             <w:pPr>
@@ -2967,7 +2481,7 @@
                 <w:rFonts w:ascii="Cordia New" w:hAnsi="Cordia New"/>
                 <w:sz w:val="26"/>
               </w:rPr>
-              <w:t>ข้อมูลที่ส่งมาไม่ถูกต้องตามเงื่อนไข (เช่น อีเมลผิดฟอร์แมต, รหัสผ่านสั้นเกินไป)</w:t>
+              <w:t>ข้อมูลที่ส่งมาไม่ถูกต้องตามเงื่อนไข (เช่น อีเมลผิดฟอร์แมต, รหัสผ่านสั้นกว่า 8 ตัว)</w:t>
             </w:r>
           </w:p>
         </w:tc>
@@ -2975,7 +2489,7 @@
       <w:tr>
         <w:tc>
           <w:tcPr>
-            <w:tcW w:type="dxa" w:w="3168"/>
+            <w:tcW w:type="dxa" w:w="3120"/>
             <w:tcMar>
               <w:top w:w="80" w:type="dxa"/>
               <w:bottom w:w="80" w:type="dxa"/>
@@ -3000,7 +2514,7 @@
         </w:tc>
         <w:tc>
           <w:tcPr>
-            <w:tcW w:type="dxa" w:w="1584"/>
+            <w:tcW w:type="dxa" w:w="3120"/>
             <w:tcMar>
               <w:top w:w="80" w:type="dxa"/>
               <w:bottom w:w="80" w:type="dxa"/>
@@ -3024,7 +2538,7 @@
         </w:tc>
         <w:tc>
           <w:tcPr>
-            <w:tcW w:type="dxa" w:w="4608"/>
+            <w:tcW w:type="dxa" w:w="3120"/>
             <w:tcMar>
               <w:top w:w="80" w:type="dxa"/>
               <w:bottom w:w="80" w:type="dxa"/>
@@ -3050,14 +2564,13 @@
       <w:tr>
         <w:tc>
           <w:tcPr>
-            <w:tcW w:type="dxa" w:w="3168"/>
+            <w:tcW w:type="dxa" w:w="3120"/>
             <w:tcMar>
               <w:top w:w="80" w:type="dxa"/>
               <w:bottom w:w="80" w:type="dxa"/>
               <w:left w:w="100" w:type="dxa"/>
               <w:right w:w="100" w:type="dxa"/>
             </w:tcMar>
-            <w:shd w:fill="FFFFFF"/>
           </w:tcPr>
           <w:p>
             <w:pPr>
@@ -3075,14 +2588,13 @@
         </w:tc>
         <w:tc>
           <w:tcPr>
-            <w:tcW w:type="dxa" w:w="1584"/>
+            <w:tcW w:type="dxa" w:w="3120"/>
             <w:tcMar>
               <w:top w:w="80" w:type="dxa"/>
               <w:bottom w:w="80" w:type="dxa"/>
               <w:left w:w="100" w:type="dxa"/>
               <w:right w:w="100" w:type="dxa"/>
             </w:tcMar>
-            <w:shd w:fill="FFFFFF"/>
           </w:tcPr>
           <w:p>
             <w:pPr>
@@ -3099,14 +2611,13 @@
         </w:tc>
         <w:tc>
           <w:tcPr>
-            <w:tcW w:type="dxa" w:w="4608"/>
+            <w:tcW w:type="dxa" w:w="3120"/>
             <w:tcMar>
               <w:top w:w="80" w:type="dxa"/>
               <w:bottom w:w="80" w:type="dxa"/>
               <w:left w:w="100" w:type="dxa"/>
               <w:right w:w="100" w:type="dxa"/>
             </w:tcMar>
-            <w:shd w:fill="FFFFFF"/>
           </w:tcPr>
           <w:p>
             <w:pPr>
@@ -3125,7 +2636,7 @@
       <w:tr>
         <w:tc>
           <w:tcPr>
-            <w:tcW w:type="dxa" w:w="3168"/>
+            <w:tcW w:type="dxa" w:w="3120"/>
             <w:tcMar>
               <w:top w:w="80" w:type="dxa"/>
               <w:bottom w:w="80" w:type="dxa"/>
@@ -3150,7 +2661,7 @@
         </w:tc>
         <w:tc>
           <w:tcPr>
-            <w:tcW w:type="dxa" w:w="1584"/>
+            <w:tcW w:type="dxa" w:w="3120"/>
             <w:tcMar>
               <w:top w:w="80" w:type="dxa"/>
               <w:bottom w:w="80" w:type="dxa"/>
@@ -3174,7 +2685,7 @@
         </w:tc>
         <w:tc>
           <w:tcPr>
-            <w:tcW w:type="dxa" w:w="4608"/>
+            <w:tcW w:type="dxa" w:w="3120"/>
             <w:tcMar>
               <w:top w:w="80" w:type="dxa"/>
               <w:bottom w:w="80" w:type="dxa"/>
@@ -3200,14 +2711,13 @@
       <w:tr>
         <w:tc>
           <w:tcPr>
-            <w:tcW w:type="dxa" w:w="3168"/>
+            <w:tcW w:type="dxa" w:w="3120"/>
             <w:tcMar>
               <w:top w:w="80" w:type="dxa"/>
               <w:bottom w:w="80" w:type="dxa"/>
               <w:left w:w="100" w:type="dxa"/>
               <w:right w:w="100" w:type="dxa"/>
             </w:tcMar>
-            <w:shd w:fill="FFFFFF"/>
           </w:tcPr>
           <w:p>
             <w:pPr>
@@ -3225,14 +2735,13 @@
         </w:tc>
         <w:tc>
           <w:tcPr>
-            <w:tcW w:type="dxa" w:w="1584"/>
+            <w:tcW w:type="dxa" w:w="3120"/>
             <w:tcMar>
               <w:top w:w="80" w:type="dxa"/>
               <w:bottom w:w="80" w:type="dxa"/>
               <w:left w:w="100" w:type="dxa"/>
               <w:right w:w="100" w:type="dxa"/>
             </w:tcMar>
-            <w:shd w:fill="FFFFFF"/>
           </w:tcPr>
           <w:p>
             <w:pPr>
@@ -3249,14 +2758,13 @@
         </w:tc>
         <w:tc>
           <w:tcPr>
-            <w:tcW w:type="dxa" w:w="4608"/>
+            <w:tcW w:type="dxa" w:w="3120"/>
             <w:tcMar>
               <w:top w:w="80" w:type="dxa"/>
               <w:bottom w:w="80" w:type="dxa"/>
               <w:left w:w="100" w:type="dxa"/>
               <w:right w:w="100" w:type="dxa"/>
             </w:tcMar>
-            <w:shd w:fill="FFFFFF"/>
           </w:tcPr>
           <w:p>
             <w:pPr>
@@ -3267,7 +2775,7 @@
                 <w:rFonts w:ascii="Cordia New" w:hAnsi="Cordia New"/>
                 <w:sz w:val="26"/>
               </w:rPr>
-              <w:t>ไม่พบเรคคอร์ดรูปภาพ หรือพยายามเข้าถึงภาพของผู้อื่น (IDOR Protection)</w:t>
+              <w:t>ไม่พบเรคคอร์ดรูปภาพ หรือพยายามเข้าถึงภาพของผู้อื่น</w:t>
             </w:r>
           </w:p>
         </w:tc>
@@ -3275,7 +2783,7 @@
       <w:tr>
         <w:tc>
           <w:tcPr>
-            <w:tcW w:type="dxa" w:w="3168"/>
+            <w:tcW w:type="dxa" w:w="3120"/>
             <w:tcMar>
               <w:top w:w="80" w:type="dxa"/>
               <w:bottom w:w="80" w:type="dxa"/>
@@ -3300,7 +2808,7 @@
         </w:tc>
         <w:tc>
           <w:tcPr>
-            <w:tcW w:type="dxa" w:w="1584"/>
+            <w:tcW w:type="dxa" w:w="3120"/>
             <w:tcMar>
               <w:top w:w="80" w:type="dxa"/>
               <w:bottom w:w="80" w:type="dxa"/>
@@ -3324,7 +2832,7 @@
         </w:tc>
         <w:tc>
           <w:tcPr>
-            <w:tcW w:type="dxa" w:w="4608"/>
+            <w:tcW w:type="dxa" w:w="3120"/>
             <w:tcMar>
               <w:top w:w="80" w:type="dxa"/>
               <w:bottom w:w="80" w:type="dxa"/>
@@ -3350,314 +2858,13 @@
       <w:tr>
         <w:tc>
           <w:tcPr>
-            <w:tcW w:type="dxa" w:w="3168"/>
+            <w:tcW w:type="dxa" w:w="3120"/>
             <w:tcMar>
               <w:top w:w="80" w:type="dxa"/>
               <w:bottom w:w="80" w:type="dxa"/>
               <w:left w:w="100" w:type="dxa"/>
               <w:right w:w="100" w:type="dxa"/>
             </w:tcMar>
-            <w:shd w:fill="FFFFFF"/>
-          </w:tcPr>
-          <w:p>
-            <w:pPr>
-              <w:spacing w:line="276" w:lineRule="auto"/>
-            </w:pPr>
-            <w:r>
-              <w:rPr>
-                <w:rFonts w:ascii="Cordia New" w:hAnsi="Cordia New"/>
-                <w:b/>
-                <w:sz w:val="26"/>
-              </w:rPr>
-              <w:t>INVALID_IMAGE</w:t>
-            </w:r>
-          </w:p>
-        </w:tc>
-        <w:tc>
-          <w:tcPr>
-            <w:tcW w:type="dxa" w:w="1584"/>
-            <w:tcMar>
-              <w:top w:w="80" w:type="dxa"/>
-              <w:bottom w:w="80" w:type="dxa"/>
-              <w:left w:w="100" w:type="dxa"/>
-              <w:right w:w="100" w:type="dxa"/>
-            </w:tcMar>
-            <w:shd w:fill="FFFFFF"/>
-          </w:tcPr>
-          <w:p>
-            <w:pPr>
-              <w:spacing w:line="276" w:lineRule="auto"/>
-            </w:pPr>
-            <w:r>
-              <w:rPr>
-                <w:rFonts w:ascii="Cordia New" w:hAnsi="Cordia New"/>
-                <w:sz w:val="26"/>
-              </w:rPr>
-              <w:t>400</w:t>
-            </w:r>
-          </w:p>
-        </w:tc>
-        <w:tc>
-          <w:tcPr>
-            <w:tcW w:type="dxa" w:w="4608"/>
-            <w:tcMar>
-              <w:top w:w="80" w:type="dxa"/>
-              <w:bottom w:w="80" w:type="dxa"/>
-              <w:left w:w="100" w:type="dxa"/>
-              <w:right w:w="100" w:type="dxa"/>
-            </w:tcMar>
-            <w:shd w:fill="FFFFFF"/>
-          </w:tcPr>
-          <w:p>
-            <w:pPr>
-              <w:spacing w:line="276" w:lineRule="auto"/>
-            </w:pPr>
-            <w:r>
-              <w:rPr>
-                <w:rFonts w:ascii="Cordia New" w:hAnsi="Cordia New"/>
-                <w:sz w:val="26"/>
-              </w:rPr>
-              <w:t>ไฟล์รูปภาพเสียหายหรือไม่สามารถ Decode ไบนารีภาพได้</w:t>
-            </w:r>
-          </w:p>
-        </w:tc>
-      </w:tr>
-      <w:tr>
-        <w:tc>
-          <w:tcPr>
-            <w:tcW w:type="dxa" w:w="3168"/>
-            <w:tcMar>
-              <w:top w:w="80" w:type="dxa"/>
-              <w:bottom w:w="80" w:type="dxa"/>
-              <w:left w:w="100" w:type="dxa"/>
-              <w:right w:w="100" w:type="dxa"/>
-            </w:tcMar>
-            <w:shd w:fill="FAFAFA"/>
-          </w:tcPr>
-          <w:p>
-            <w:pPr>
-              <w:spacing w:line="276" w:lineRule="auto"/>
-            </w:pPr>
-            <w:r>
-              <w:rPr>
-                <w:rFonts w:ascii="Cordia New" w:hAnsi="Cordia New"/>
-                <w:b/>
-                <w:sz w:val="26"/>
-              </w:rPr>
-              <w:t>UNSUPPORTED_FILE_TYPE</w:t>
-            </w:r>
-          </w:p>
-        </w:tc>
-        <w:tc>
-          <w:tcPr>
-            <w:tcW w:type="dxa" w:w="1584"/>
-            <w:tcMar>
-              <w:top w:w="80" w:type="dxa"/>
-              <w:bottom w:w="80" w:type="dxa"/>
-              <w:left w:w="100" w:type="dxa"/>
-              <w:right w:w="100" w:type="dxa"/>
-            </w:tcMar>
-            <w:shd w:fill="FAFAFA"/>
-          </w:tcPr>
-          <w:p>
-            <w:pPr>
-              <w:spacing w:line="276" w:lineRule="auto"/>
-            </w:pPr>
-            <w:r>
-              <w:rPr>
-                <w:rFonts w:ascii="Cordia New" w:hAnsi="Cordia New"/>
-                <w:sz w:val="26"/>
-              </w:rPr>
-              <w:t>415</w:t>
-            </w:r>
-          </w:p>
-        </w:tc>
-        <w:tc>
-          <w:tcPr>
-            <w:tcW w:type="dxa" w:w="4608"/>
-            <w:tcMar>
-              <w:top w:w="80" w:type="dxa"/>
-              <w:bottom w:w="80" w:type="dxa"/>
-              <w:left w:w="100" w:type="dxa"/>
-              <w:right w:w="100" w:type="dxa"/>
-            </w:tcMar>
-            <w:shd w:fill="FAFAFA"/>
-          </w:tcPr>
-          <w:p>
-            <w:pPr>
-              <w:spacing w:line="276" w:lineRule="auto"/>
-            </w:pPr>
-            <w:r>
-              <w:rPr>
-                <w:rFonts w:ascii="Cordia New" w:hAnsi="Cordia New"/>
-                <w:sz w:val="26"/>
-              </w:rPr>
-              <w:t>ประเภทไฟล์ไม่ถูกต้อง (รองรับเฉพาะ jpg, jpeg, png, webp)</w:t>
-            </w:r>
-          </w:p>
-        </w:tc>
-      </w:tr>
-      <w:tr>
-        <w:tc>
-          <w:tcPr>
-            <w:tcW w:type="dxa" w:w="3168"/>
-            <w:tcMar>
-              <w:top w:w="80" w:type="dxa"/>
-              <w:bottom w:w="80" w:type="dxa"/>
-              <w:left w:w="100" w:type="dxa"/>
-              <w:right w:w="100" w:type="dxa"/>
-            </w:tcMar>
-            <w:shd w:fill="FFFFFF"/>
-          </w:tcPr>
-          <w:p>
-            <w:pPr>
-              <w:spacing w:line="276" w:lineRule="auto"/>
-            </w:pPr>
-            <w:r>
-              <w:rPr>
-                <w:rFonts w:ascii="Cordia New" w:hAnsi="Cordia New"/>
-                <w:b/>
-                <w:sz w:val="26"/>
-              </w:rPr>
-              <w:t>MODEL_UNAVAILABLE</w:t>
-            </w:r>
-          </w:p>
-        </w:tc>
-        <w:tc>
-          <w:tcPr>
-            <w:tcW w:type="dxa" w:w="1584"/>
-            <w:tcMar>
-              <w:top w:w="80" w:type="dxa"/>
-              <w:bottom w:w="80" w:type="dxa"/>
-              <w:left w:w="100" w:type="dxa"/>
-              <w:right w:w="100" w:type="dxa"/>
-            </w:tcMar>
-            <w:shd w:fill="FFFFFF"/>
-          </w:tcPr>
-          <w:p>
-            <w:pPr>
-              <w:spacing w:line="276" w:lineRule="auto"/>
-            </w:pPr>
-            <w:r>
-              <w:rPr>
-                <w:rFonts w:ascii="Cordia New" w:hAnsi="Cordia New"/>
-                <w:sz w:val="26"/>
-              </w:rPr>
-              <w:t>503</w:t>
-            </w:r>
-          </w:p>
-        </w:tc>
-        <w:tc>
-          <w:tcPr>
-            <w:tcW w:type="dxa" w:w="4608"/>
-            <w:tcMar>
-              <w:top w:w="80" w:type="dxa"/>
-              <w:bottom w:w="80" w:type="dxa"/>
-              <w:left w:w="100" w:type="dxa"/>
-              <w:right w:w="100" w:type="dxa"/>
-            </w:tcMar>
-            <w:shd w:fill="FFFFFF"/>
-          </w:tcPr>
-          <w:p>
-            <w:pPr>
-              <w:spacing w:line="276" w:lineRule="auto"/>
-            </w:pPr>
-            <w:r>
-              <w:rPr>
-                <w:rFonts w:ascii="Cordia New" w:hAnsi="Cordia New"/>
-                <w:sz w:val="26"/>
-              </w:rPr>
-              <w:t>ไม่สามารถดาวน์โหลดหรือโหลดโมเดล MediaPipe ขึ้นหน่วยความจำได้</w:t>
-            </w:r>
-          </w:p>
-        </w:tc>
-      </w:tr>
-      <w:tr>
-        <w:tc>
-          <w:tcPr>
-            <w:tcW w:type="dxa" w:w="3168"/>
-            <w:tcMar>
-              <w:top w:w="80" w:type="dxa"/>
-              <w:bottom w:w="80" w:type="dxa"/>
-              <w:left w:w="100" w:type="dxa"/>
-              <w:right w:w="100" w:type="dxa"/>
-            </w:tcMar>
-            <w:shd w:fill="FAFAFA"/>
-          </w:tcPr>
-          <w:p>
-            <w:pPr>
-              <w:spacing w:line="276" w:lineRule="auto"/>
-            </w:pPr>
-            <w:r>
-              <w:rPr>
-                <w:rFonts w:ascii="Cordia New" w:hAnsi="Cordia New"/>
-                <w:b/>
-                <w:sz w:val="26"/>
-              </w:rPr>
-              <w:t>GENERATION_FAILED</w:t>
-            </w:r>
-          </w:p>
-        </w:tc>
-        <w:tc>
-          <w:tcPr>
-            <w:tcW w:type="dxa" w:w="1584"/>
-            <w:tcMar>
-              <w:top w:w="80" w:type="dxa"/>
-              <w:bottom w:w="80" w:type="dxa"/>
-              <w:left w:w="100" w:type="dxa"/>
-              <w:right w:w="100" w:type="dxa"/>
-            </w:tcMar>
-            <w:shd w:fill="FAFAFA"/>
-          </w:tcPr>
-          <w:p>
-            <w:pPr>
-              <w:spacing w:line="276" w:lineRule="auto"/>
-            </w:pPr>
-            <w:r>
-              <w:rPr>
-                <w:rFonts w:ascii="Cordia New" w:hAnsi="Cordia New"/>
-                <w:sz w:val="26"/>
-              </w:rPr>
-              <w:t>500</w:t>
-            </w:r>
-          </w:p>
-        </w:tc>
-        <w:tc>
-          <w:tcPr>
-            <w:tcW w:type="dxa" w:w="4608"/>
-            <w:tcMar>
-              <w:top w:w="80" w:type="dxa"/>
-              <w:bottom w:w="80" w:type="dxa"/>
-              <w:left w:w="100" w:type="dxa"/>
-              <w:right w:w="100" w:type="dxa"/>
-            </w:tcMar>
-            <w:shd w:fill="FAFAFA"/>
-          </w:tcPr>
-          <w:p>
-            <w:pPr>
-              <w:spacing w:line="276" w:lineRule="auto"/>
-            </w:pPr>
-            <w:r>
-              <w:rPr>
-                <w:rFonts w:ascii="Cordia New" w:hAnsi="Cordia New"/>
-                <w:sz w:val="26"/>
-              </w:rPr>
-              <w:t>การประมวลผลสร้างภาพหรือตัดภาพล้มเหลว</w:t>
-            </w:r>
-          </w:p>
-        </w:tc>
-      </w:tr>
-      <w:tr>
-        <w:tc>
-          <w:tcPr>
-            <w:tcW w:type="dxa" w:w="3168"/>
-            <w:tcMar>
-              <w:top w:w="80" w:type="dxa"/>
-              <w:bottom w:w="80" w:type="dxa"/>
-              <w:left w:w="100" w:type="dxa"/>
-              <w:right w:w="100" w:type="dxa"/>
-            </w:tcMar>
-            <w:shd w:fill="FFFFFF"/>
           </w:tcPr>
           <w:p>
             <w:pPr>
@@ -3675,14 +2882,13 @@
         </w:tc>
         <w:tc>
           <w:tcPr>
-            <w:tcW w:type="dxa" w:w="1584"/>
+            <w:tcW w:type="dxa" w:w="3120"/>
             <w:tcMar>
               <w:top w:w="80" w:type="dxa"/>
               <w:bottom w:w="80" w:type="dxa"/>
               <w:left w:w="100" w:type="dxa"/>
               <w:right w:w="100" w:type="dxa"/>
             </w:tcMar>
-            <w:shd w:fill="FFFFFF"/>
           </w:tcPr>
           <w:p>
             <w:pPr>
@@ -3699,14 +2905,13 @@
         </w:tc>
         <w:tc>
           <w:tcPr>
-            <w:tcW w:type="dxa" w:w="4608"/>
+            <w:tcW w:type="dxa" w:w="3120"/>
             <w:tcMar>
               <w:top w:w="80" w:type="dxa"/>
               <w:bottom w:w="80" w:type="dxa"/>
               <w:left w:w="100" w:type="dxa"/>
               <w:right w:w="100" w:type="dxa"/>
             </w:tcMar>
-            <w:shd w:fill="FFFFFF"/>
           </w:tcPr>
           <w:p>
             <w:pPr>
@@ -3717,7 +2922,7 @@
                 <w:rFonts w:ascii="Cordia New" w:hAnsi="Cordia New"/>
                 <w:sz w:val="26"/>
               </w:rPr>
-              <w:t>คิวงานบน AI Server แน่นเกินเวลาที่กำหนดให้รอได้ (เกิน 120 วินาที)</w:t>
+              <w:t>คิวงานบน AI Server แน่นเกินเวลาที่กำหนดให้รอได้</w:t>
             </w:r>
           </w:p>
         </w:tc>
@@ -3725,7 +2930,7 @@
       <w:tr>
         <w:tc>
           <w:tcPr>
-            <w:tcW w:type="dxa" w:w="3168"/>
+            <w:tcW w:type="dxa" w:w="3120"/>
             <w:tcMar>
               <w:top w:w="80" w:type="dxa"/>
               <w:bottom w:w="80" w:type="dxa"/>
@@ -3750,7 +2955,7 @@
         </w:tc>
         <w:tc>
           <w:tcPr>
-            <w:tcW w:type="dxa" w:w="1584"/>
+            <w:tcW w:type="dxa" w:w="3120"/>
             <w:tcMar>
               <w:top w:w="80" w:type="dxa"/>
               <w:bottom w:w="80" w:type="dxa"/>
@@ -3774,7 +2979,7 @@
         </w:tc>
         <w:tc>
           <w:tcPr>
-            <w:tcW w:type="dxa" w:w="4608"/>
+            <w:tcW w:type="dxa" w:w="3120"/>
             <w:tcMar>
               <w:top w:w="80" w:type="dxa"/>
               <w:bottom w:w="80" w:type="dxa"/>
@@ -3800,14 +3005,13 @@
       <w:tr>
         <w:tc>
           <w:tcPr>
-            <w:tcW w:type="dxa" w:w="3168"/>
+            <w:tcW w:type="dxa" w:w="3120"/>
             <w:tcMar>
               <w:top w:w="80" w:type="dxa"/>
               <w:bottom w:w="80" w:type="dxa"/>
               <w:left w:w="100" w:type="dxa"/>
               <w:right w:w="100" w:type="dxa"/>
             </w:tcMar>
-            <w:shd w:fill="FFFFFF"/>
           </w:tcPr>
           <w:p>
             <w:pPr>
@@ -3825,14 +3029,13 @@
         </w:tc>
         <w:tc>
           <w:tcPr>
-            <w:tcW w:type="dxa" w:w="1584"/>
+            <w:tcW w:type="dxa" w:w="3120"/>
             <w:tcMar>
               <w:top w:w="80" w:type="dxa"/>
               <w:bottom w:w="80" w:type="dxa"/>
               <w:left w:w="100" w:type="dxa"/>
               <w:right w:w="100" w:type="dxa"/>
             </w:tcMar>
-            <w:shd w:fill="FFFFFF"/>
           </w:tcPr>
           <w:p>
             <w:pPr>
@@ -3849,14 +3052,13 @@
         </w:tc>
         <w:tc>
           <w:tcPr>
-            <w:tcW w:type="dxa" w:w="4608"/>
+            <w:tcW w:type="dxa" w:w="3120"/>
             <w:tcMar>
               <w:top w:w="80" w:type="dxa"/>
               <w:bottom w:w="80" w:type="dxa"/>
               <w:left w:w="100" w:type="dxa"/>
               <w:right w:w="100" w:type="dxa"/>
             </w:tcMar>
-            <w:shd w:fill="FFFFFF"/>
           </w:tcPr>
           <w:p>
             <w:pPr>
@@ -3875,7 +3077,7 @@
       <w:tr>
         <w:tc>
           <w:tcPr>
-            <w:tcW w:type="dxa" w:w="3168"/>
+            <w:tcW w:type="dxa" w:w="3120"/>
             <w:tcMar>
               <w:top w:w="80" w:type="dxa"/>
               <w:bottom w:w="80" w:type="dxa"/>
@@ -3900,7 +3102,7 @@
         </w:tc>
         <w:tc>
           <w:tcPr>
-            <w:tcW w:type="dxa" w:w="1584"/>
+            <w:tcW w:type="dxa" w:w="3120"/>
             <w:tcMar>
               <w:top w:w="80" w:type="dxa"/>
               <w:bottom w:w="80" w:type="dxa"/>
@@ -3924,7 +3126,7 @@
         </w:tc>
         <w:tc>
           <w:tcPr>
-            <w:tcW w:type="dxa" w:w="4608"/>
+            <w:tcW w:type="dxa" w:w="3120"/>
             <w:tcMar>
               <w:top w:w="80" w:type="dxa"/>
               <w:bottom w:w="80" w:type="dxa"/>

</xml_diff>